<commit_message>
completed 5 ML coding questions
</commit_message>
<xml_diff>
--- a/ML Set Questions/1.ML_Set1_krithikshaAns/3.Scenario based/ML- scenario based  set 1.docx
+++ b/ML Set Questions/1.ML_Set1_krithikshaAns/3.Scenario based/ML- scenario based  set 1.docx
@@ -247,7 +247,7 @@
                           </a:pathLst>
                         </a:custGeom>
                         <a:blipFill>
-                          <a:blip r:embed="rId12"/>
+                          <a:blip r:embed="rId11"/>
                           <a:stretch>
                             <a:fillRect/>
                           </a:stretch>
@@ -337,7 +337,35 @@
                                 <w:szCs w:val="20"/>
                                 <w:lang w:val="en-US"/>
                               </w:rPr>
-                              <w:t xml:space="preserve">   Ramishahope Artificial Intelligence Pvt Ltd</w:t>
+                              <w:t xml:space="preserve">   </w:t>
+                            </w:r>
+                            <w:proofErr w:type="spellStart"/>
+                            <w:r>
+                              <w:rPr>
+                                <w:rFonts w:ascii="Calibri" w:eastAsia="Poppins Bold" w:hAnsi="Calibri" w:cs="Calibri"/>
+                                <w:b/>
+                                <w:bCs/>
+                                <w:color w:val="000000"/>
+                                <w:kern w:val="24"/>
+                                <w:sz w:val="20"/>
+                                <w:szCs w:val="20"/>
+                                <w:lang w:val="en-US"/>
+                              </w:rPr>
+                              <w:t>Ramishahope</w:t>
+                            </w:r>
+                            <w:proofErr w:type="spellEnd"/>
+                            <w:r>
+                              <w:rPr>
+                                <w:rFonts w:ascii="Calibri" w:eastAsia="Poppins Bold" w:hAnsi="Calibri" w:cs="Calibri"/>
+                                <w:b/>
+                                <w:bCs/>
+                                <w:color w:val="000000"/>
+                                <w:kern w:val="24"/>
+                                <w:sz w:val="20"/>
+                                <w:szCs w:val="20"/>
+                                <w:lang w:val="en-US"/>
+                              </w:rPr>
+                              <w:t xml:space="preserve"> Artificial Intelligence Pvt Ltd</w:t>
                             </w:r>
                           </w:p>
                           <w:p>
@@ -367,7 +395,91 @@
                                 <w:szCs w:val="20"/>
                                 <w:lang w:val="en-US"/>
                               </w:rPr>
-                              <w:t>36, Old Anandas, SG Arcade, Marudhamalai Main Road, Vadavalli, Coimbatore -641041.</w:t>
+                              <w:t xml:space="preserve">36, Old </w:t>
+                            </w:r>
+                            <w:proofErr w:type="spellStart"/>
+                            <w:r>
+                              <w:rPr>
+                                <w:rFonts w:ascii="Calibri" w:eastAsia="Poppins Bold" w:hAnsi="Calibri" w:cs="Calibri"/>
+                                <w:b/>
+                                <w:bCs/>
+                                <w:color w:val="000000"/>
+                                <w:kern w:val="24"/>
+                                <w:sz w:val="20"/>
+                                <w:szCs w:val="20"/>
+                                <w:lang w:val="en-US"/>
+                              </w:rPr>
+                              <w:t>Anandas</w:t>
+                            </w:r>
+                            <w:proofErr w:type="spellEnd"/>
+                            <w:r>
+                              <w:rPr>
+                                <w:rFonts w:ascii="Calibri" w:eastAsia="Poppins Bold" w:hAnsi="Calibri" w:cs="Calibri"/>
+                                <w:b/>
+                                <w:bCs/>
+                                <w:color w:val="000000"/>
+                                <w:kern w:val="24"/>
+                                <w:sz w:val="20"/>
+                                <w:szCs w:val="20"/>
+                                <w:lang w:val="en-US"/>
+                              </w:rPr>
+                              <w:t xml:space="preserve">, SG Arcade, </w:t>
+                            </w:r>
+                            <w:proofErr w:type="spellStart"/>
+                            <w:r>
+                              <w:rPr>
+                                <w:rFonts w:ascii="Calibri" w:eastAsia="Poppins Bold" w:hAnsi="Calibri" w:cs="Calibri"/>
+                                <w:b/>
+                                <w:bCs/>
+                                <w:color w:val="000000"/>
+                                <w:kern w:val="24"/>
+                                <w:sz w:val="20"/>
+                                <w:szCs w:val="20"/>
+                                <w:lang w:val="en-US"/>
+                              </w:rPr>
+                              <w:t>Marudhamalai</w:t>
+                            </w:r>
+                            <w:proofErr w:type="spellEnd"/>
+                            <w:r>
+                              <w:rPr>
+                                <w:rFonts w:ascii="Calibri" w:eastAsia="Poppins Bold" w:hAnsi="Calibri" w:cs="Calibri"/>
+                                <w:b/>
+                                <w:bCs/>
+                                <w:color w:val="000000"/>
+                                <w:kern w:val="24"/>
+                                <w:sz w:val="20"/>
+                                <w:szCs w:val="20"/>
+                                <w:lang w:val="en-US"/>
+                              </w:rPr>
+                              <w:t xml:space="preserve"> Main Road, </w:t>
+                            </w:r>
+                            <w:proofErr w:type="spellStart"/>
+                            <w:r>
+                              <w:rPr>
+                                <w:rFonts w:ascii="Calibri" w:eastAsia="Poppins Bold" w:hAnsi="Calibri" w:cs="Calibri"/>
+                                <w:b/>
+                                <w:bCs/>
+                                <w:color w:val="000000"/>
+                                <w:kern w:val="24"/>
+                                <w:sz w:val="20"/>
+                                <w:szCs w:val="20"/>
+                                <w:lang w:val="en-US"/>
+                              </w:rPr>
+                              <w:t>Vadavalli</w:t>
+                            </w:r>
+                            <w:proofErr w:type="spellEnd"/>
+                            <w:r>
+                              <w:rPr>
+                                <w:rFonts w:ascii="Calibri" w:eastAsia="Poppins Bold" w:hAnsi="Calibri" w:cs="Calibri"/>
+                                <w:b/>
+                                <w:bCs/>
+                                <w:color w:val="000000"/>
+                                <w:kern w:val="24"/>
+                                <w:sz w:val="20"/>
+                                <w:szCs w:val="20"/>
+                                <w:lang w:val="en-US"/>
+                              </w:rPr>
+                              <w:t>, Coimbatore -641041.</w:t>
                             </w:r>
                           </w:p>
                           <w:p>
@@ -680,13 +792,7 @@
         <w:rPr>
           <w:color w:val="1F497D" w:themeColor="text2"/>
         </w:rPr>
-        <w:t>problem type</w:t>
-      </w:r>
-      <w:r>
-        <w:rPr>
-          <w:color w:val="1F497D" w:themeColor="text2"/>
-        </w:rPr>
-        <w:t xml:space="preserve"> = regression problem (as the house price is continuous value)</w:t>
+        <w:t xml:space="preserve">problem type = </w:t>
       </w:r>
     </w:p>
     <w:p>
@@ -700,13 +806,63 @@
         <w:rPr>
           <w:color w:val="1F497D" w:themeColor="text2"/>
         </w:rPr>
-        <w:t>step-by-step logic</w:t>
-      </w:r>
-      <w:r>
-        <w:rPr>
-          <w:color w:val="1F497D" w:themeColor="text2"/>
-        </w:rPr>
-        <w:t>:</w:t>
+        <w:t xml:space="preserve">step 1: Machine Learning </w:t>
+      </w:r>
+    </w:p>
+    <w:p>
+      <w:pPr>
+        <w:ind w:left="720"/>
+        <w:rPr>
+          <w:color w:val="1F497D" w:themeColor="text2"/>
+        </w:rPr>
+      </w:pPr>
+      <w:r>
+        <w:rPr>
+          <w:color w:val="1F497D" w:themeColor="text2"/>
+        </w:rPr>
+        <w:t xml:space="preserve">step 2: supervised Learning </w:t>
+      </w:r>
+    </w:p>
+    <w:p>
+      <w:pPr>
+        <w:ind w:left="720"/>
+        <w:rPr>
+          <w:color w:val="1F497D" w:themeColor="text2"/>
+        </w:rPr>
+      </w:pPr>
+      <w:r>
+        <w:rPr>
+          <w:color w:val="1F497D" w:themeColor="text2"/>
+        </w:rPr>
+        <w:t xml:space="preserve">step 3: </w:t>
+      </w:r>
+      <w:r>
+        <w:rPr>
+          <w:color w:val="1F497D" w:themeColor="text2"/>
+        </w:rPr>
+        <w:t>regression problem (as the house price is continuous value)</w:t>
+      </w:r>
+    </w:p>
+    <w:p>
+      <w:pPr>
+        <w:ind w:left="720"/>
+        <w:rPr>
+          <w:color w:val="1F497D" w:themeColor="text2"/>
+        </w:rPr>
+      </w:pPr>
+    </w:p>
+    <w:p>
+      <w:pPr>
+        <w:ind w:left="720"/>
+        <w:rPr>
+          <w:color w:val="1F497D" w:themeColor="text2"/>
+        </w:rPr>
+      </w:pPr>
+      <w:r>
+        <w:rPr>
+          <w:color w:val="1F497D" w:themeColor="text2"/>
+        </w:rPr>
+        <w:t>step-by-step logic:</w:t>
       </w:r>
     </w:p>
     <w:p>
@@ -726,6 +882,7 @@
         </w:rPr>
         <w:t xml:space="preserve">Load the </w:t>
       </w:r>
+      <w:proofErr w:type="spellStart"/>
       <w:r>
         <w:rPr>
           <w:color w:val="1F497D" w:themeColor="text2"/>
@@ -736,7 +893,14 @@
         <w:rPr>
           <w:color w:val="1F497D" w:themeColor="text2"/>
         </w:rPr>
-        <w:t>houseprices dataset</w:t>
+        <w:t>houseprices</w:t>
+      </w:r>
+      <w:proofErr w:type="spellEnd"/>
+      <w:r>
+        <w:rPr>
+          <w:color w:val="1F497D" w:themeColor="text2"/>
+        </w:rPr>
+        <w:t xml:space="preserve"> dataset</w:t>
       </w:r>
     </w:p>
     <w:p>
@@ -751,8 +915,16 @@
         <w:rPr>
           <w:color w:val="1F497D" w:themeColor="text2"/>
         </w:rPr>
-        <w:t>Convert the categorical data (location column) into numerical data using pd.get_dummies</w:t>
-      </w:r>
+        <w:t xml:space="preserve">Convert the categorical data (location column) into numerical data using </w:t>
+      </w:r>
+      <w:proofErr w:type="spellStart"/>
+      <w:r>
+        <w:rPr>
+          <w:color w:val="1F497D" w:themeColor="text2"/>
+        </w:rPr>
+        <w:t>pd.get_dummies</w:t>
+      </w:r>
+      <w:proofErr w:type="spellEnd"/>
     </w:p>
     <w:p>
       <w:pPr>
@@ -772,7 +944,35 @@
         <w:rPr>
           <w:color w:val="1F497D" w:themeColor="text2"/>
         </w:rPr>
-        <w:t xml:space="preserve">(square_footage, number_of_bedrooms, location) </w:t>
+        <w:t>(</w:t>
+      </w:r>
+      <w:proofErr w:type="spellStart"/>
+      <w:r>
+        <w:rPr>
+          <w:color w:val="1F497D" w:themeColor="text2"/>
+        </w:rPr>
+        <w:t>square_footage</w:t>
+      </w:r>
+      <w:proofErr w:type="spellEnd"/>
+      <w:r>
+        <w:rPr>
+          <w:color w:val="1F497D" w:themeColor="text2"/>
+        </w:rPr>
+        <w:t xml:space="preserve">, </w:t>
+      </w:r>
+      <w:proofErr w:type="spellStart"/>
+      <w:r>
+        <w:rPr>
+          <w:color w:val="1F497D" w:themeColor="text2"/>
+        </w:rPr>
+        <w:t>number_of_bedrooms</w:t>
+      </w:r>
+      <w:proofErr w:type="spellEnd"/>
+      <w:r>
+        <w:rPr>
+          <w:color w:val="1F497D" w:themeColor="text2"/>
+        </w:rPr>
+        <w:t xml:space="preserve">, location) </w:t>
       </w:r>
       <w:r>
         <w:rPr>
@@ -784,7 +984,21 @@
         <w:rPr>
           <w:color w:val="1F497D" w:themeColor="text2"/>
         </w:rPr>
-        <w:t xml:space="preserve"> (house_price)</w:t>
+        <w:t xml:space="preserve"> (</w:t>
+      </w:r>
+      <w:proofErr w:type="spellStart"/>
+      <w:r>
+        <w:rPr>
+          <w:color w:val="1F497D" w:themeColor="text2"/>
+        </w:rPr>
+        <w:t>house_price</w:t>
+      </w:r>
+      <w:proofErr w:type="spellEnd"/>
+      <w:r>
+        <w:rPr>
+          <w:color w:val="1F497D" w:themeColor="text2"/>
+        </w:rPr>
+        <w:t>)</w:t>
       </w:r>
     </w:p>
     <w:p>
@@ -814,7 +1028,35 @@
         <w:rPr>
           <w:color w:val="1F497D" w:themeColor="text2"/>
         </w:rPr>
-        <w:t>Data preprocessing for X_train using StandardScaler – as the square footage, no of bedrooms has large-scale difference</w:t>
+        <w:t xml:space="preserve">Data preprocessing for </w:t>
+      </w:r>
+      <w:proofErr w:type="spellStart"/>
+      <w:r>
+        <w:rPr>
+          <w:color w:val="1F497D" w:themeColor="text2"/>
+        </w:rPr>
+        <w:t>X_train</w:t>
+      </w:r>
+      <w:proofErr w:type="spellEnd"/>
+      <w:r>
+        <w:rPr>
+          <w:color w:val="1F497D" w:themeColor="text2"/>
+        </w:rPr>
+        <w:t xml:space="preserve"> using </w:t>
+      </w:r>
+      <w:proofErr w:type="spellStart"/>
+      <w:r>
+        <w:rPr>
+          <w:color w:val="1F497D" w:themeColor="text2"/>
+        </w:rPr>
+        <w:t>StandardScaler</w:t>
+      </w:r>
+      <w:proofErr w:type="spellEnd"/>
+      <w:r>
+        <w:rPr>
+          <w:color w:val="1F497D" w:themeColor="text2"/>
+        </w:rPr>
+        <w:t xml:space="preserve"> – as the square footage, no of bedrooms has large-scale difference</w:t>
       </w:r>
     </w:p>
     <w:p>
@@ -829,7 +1071,21 @@
         <w:rPr>
           <w:color w:val="1F497D" w:themeColor="text2"/>
         </w:rPr>
-        <w:t>Model creation using regression algorithms (linear regression, SVR, decision tree, random forest, boosting etc…)</w:t>
+        <w:t xml:space="preserve">Model creation using regression algorithms (linear regression, SVR, decision tree, random forest, boosting </w:t>
+      </w:r>
+      <w:proofErr w:type="spellStart"/>
+      <w:r>
+        <w:rPr>
+          <w:color w:val="1F497D" w:themeColor="text2"/>
+        </w:rPr>
+        <w:t>etc</w:t>
+      </w:r>
+      <w:proofErr w:type="spellEnd"/>
+      <w:r>
+        <w:rPr>
+          <w:color w:val="1F497D" w:themeColor="text2"/>
+        </w:rPr>
+        <w:t>…)</w:t>
       </w:r>
     </w:p>
     <w:p>
@@ -936,11 +1192,87 @@
         </w:rPr>
         <w:t xml:space="preserve">Problem Type: </w:t>
       </w:r>
-      <w:r>
-        <w:rPr>
-          <w:color w:val="1F497D" w:themeColor="text2"/>
-        </w:rPr>
-        <w:t xml:space="preserve">Clustering Problem </w:t>
+    </w:p>
+    <w:p>
+      <w:pPr>
+        <w:ind w:left="720"/>
+        <w:rPr>
+          <w:color w:val="1F497D" w:themeColor="text2"/>
+        </w:rPr>
+      </w:pPr>
+      <w:r>
+        <w:rPr>
+          <w:color w:val="1F497D" w:themeColor="text2"/>
+        </w:rPr>
+        <w:t xml:space="preserve">step 1: Machine Learning </w:t>
+      </w:r>
+    </w:p>
+    <w:p>
+      <w:pPr>
+        <w:ind w:left="720"/>
+        <w:rPr>
+          <w:color w:val="1F497D" w:themeColor="text2"/>
+        </w:rPr>
+      </w:pPr>
+      <w:r>
+        <w:rPr>
+          <w:color w:val="1F497D" w:themeColor="text2"/>
+        </w:rPr>
+        <w:t xml:space="preserve">step 2: supervised Learning </w:t>
+      </w:r>
+    </w:p>
+    <w:p>
+      <w:pPr>
+        <w:ind w:left="720"/>
+        <w:rPr>
+          <w:color w:val="1F497D" w:themeColor="text2"/>
+        </w:rPr>
+      </w:pPr>
+      <w:r>
+        <w:rPr>
+          <w:color w:val="1F497D" w:themeColor="text2"/>
+        </w:rPr>
+        <w:t xml:space="preserve">step 3: </w:t>
+      </w:r>
+      <w:r>
+        <w:rPr>
+          <w:color w:val="1F497D" w:themeColor="text2"/>
+        </w:rPr>
+        <w:t>classification</w:t>
+      </w:r>
+      <w:r>
+        <w:rPr>
+          <w:color w:val="1F497D" w:themeColor="text2"/>
+        </w:rPr>
+        <w:t xml:space="preserve"> problem </w:t>
+      </w:r>
+    </w:p>
+    <w:p>
+      <w:pPr>
+        <w:ind w:left="720"/>
+        <w:rPr>
+          <w:color w:val="1F497D" w:themeColor="text2"/>
+        </w:rPr>
+      </w:pPr>
+    </w:p>
+    <w:p>
+      <w:pPr>
+        <w:ind w:left="720"/>
+        <w:rPr>
+          <w:color w:val="1F497D" w:themeColor="text2"/>
+        </w:rPr>
+      </w:pPr>
+      <w:r>
+        <w:rPr>
+          <w:color w:val="1F497D" w:themeColor="text2"/>
+        </w:rPr>
+        <w:t>Classification</w:t>
+      </w:r>
+      <w:r>
+        <w:rPr>
+          <w:color w:val="1F497D" w:themeColor="text2"/>
+        </w:rPr>
+        <w:t xml:space="preserve"> Problem </w:t>
       </w:r>
     </w:p>
     <w:p>
@@ -974,6 +1306,7 @@
         </w:rPr>
         <w:t xml:space="preserve">Load the </w:t>
       </w:r>
+      <w:proofErr w:type="spellStart"/>
       <w:r>
         <w:rPr>
           <w:color w:val="1F497D" w:themeColor="text2"/>
@@ -984,7 +1317,14 @@
         <w:rPr>
           <w:color w:val="1F497D" w:themeColor="text2"/>
         </w:rPr>
-        <w:t>customer dataset</w:t>
+        <w:t>customer</w:t>
+      </w:r>
+      <w:proofErr w:type="spellEnd"/>
+      <w:r>
+        <w:rPr>
+          <w:color w:val="1F497D" w:themeColor="text2"/>
+        </w:rPr>
+        <w:t xml:space="preserve"> dataset</w:t>
       </w:r>
     </w:p>
     <w:p>
@@ -1002,7 +1342,31 @@
         <w:rPr>
           <w:color w:val="1F497D" w:themeColor="text2"/>
         </w:rPr>
-        <w:t>Select the important features for X input data - (spending behavior, transaction history)</w:t>
+        <w:t>Split input</w:t>
+      </w:r>
+      <w:r>
+        <w:rPr>
+          <w:color w:val="1F497D" w:themeColor="text2"/>
+        </w:rPr>
+        <w:t xml:space="preserve"> (</w:t>
+      </w:r>
+      <w:r>
+        <w:rPr>
+          <w:color w:val="1F497D" w:themeColor="text2"/>
+        </w:rPr>
+        <w:t>spending behavior and transaction history) and output (</w:t>
+      </w:r>
+      <w:r>
+        <w:rPr>
+          <w:color w:val="1F497D" w:themeColor="text2"/>
+        </w:rPr>
+        <w:t>fraud/not fraud</w:t>
+      </w:r>
+      <w:r>
+        <w:rPr>
+          <w:color w:val="1F497D" w:themeColor="text2"/>
+        </w:rPr>
+        <w:t>)</w:t>
       </w:r>
     </w:p>
     <w:p>
@@ -1020,7 +1384,7 @@
         <w:rPr>
           <w:color w:val="1F497D" w:themeColor="text2"/>
         </w:rPr>
-        <w:t>Data preprocessing – Standardization</w:t>
+        <w:t>Split train &amp; test dataset</w:t>
       </w:r>
     </w:p>
     <w:p>
@@ -1038,7 +1402,7 @@
         <w:rPr>
           <w:color w:val="1F497D" w:themeColor="text2"/>
         </w:rPr>
-        <w:t xml:space="preserve">Model creation &amp; prediction of Y_labels [cluster group] – (using clustering algorithms: K means, agglomerative, DBSCAN, optics, birch etc.) </w:t>
+        <w:t>Model creation using classification algorithms.</w:t>
       </w:r>
     </w:p>
     <w:p>
@@ -1056,7 +1420,7 @@
         <w:rPr>
           <w:color w:val="1F497D" w:themeColor="text2"/>
         </w:rPr>
-        <w:t xml:space="preserve">Create a new dataset with the cluster group &amp; save it as ‘cluster.csv’ file </w:t>
+        <w:t xml:space="preserve">Test the model </w:t>
       </w:r>
     </w:p>
     <w:p>
@@ -1074,7 +1438,7 @@
         <w:rPr>
           <w:color w:val="1F497D" w:themeColor="text2"/>
         </w:rPr>
-        <w:t>Visualize the clusters using seaborn.lmplot – (for visual inspection of clusters)</w:t>
+        <w:t xml:space="preserve">Model evaluation using confusion matrix &amp; classification report </w:t>
       </w:r>
     </w:p>
     <w:p>
@@ -1092,7 +1456,191 @@
         <w:rPr>
           <w:color w:val="1F497D" w:themeColor="text2"/>
         </w:rPr>
-        <w:t xml:space="preserve">Cluster model evaluation using cluster evaluation metrics </w:t>
+        <w:lastRenderedPageBreak/>
+        <w:t xml:space="preserve">Finalize the best </w:t>
+      </w:r>
+      <w:r>
+        <w:rPr>
+          <w:color w:val="1F497D" w:themeColor="text2"/>
+        </w:rPr>
+        <w:t xml:space="preserve">model for the fraudulent transactions classification of </w:t>
+      </w:r>
+      <w:r>
+        <w:rPr>
+          <w:color w:val="1F497D" w:themeColor="text2"/>
+        </w:rPr>
+        <w:t>fraud</w:t>
+      </w:r>
+      <w:r>
+        <w:rPr>
+          <w:color w:val="1F497D" w:themeColor="text2"/>
+        </w:rPr>
+        <w:t xml:space="preserve"> or not based on the performance analyses from confusion </w:t>
+      </w:r>
+      <w:r>
+        <w:rPr>
+          <w:color w:val="1F497D" w:themeColor="text2"/>
+        </w:rPr>
+        <w:t>matrix &amp; classification report of all algorithms</w:t>
+      </w:r>
+    </w:p>
+    <w:p>
+      <w:pPr>
+        <w:rPr>
+          <w:color w:val="1F497D" w:themeColor="text2"/>
+        </w:rPr>
+      </w:pPr>
+    </w:p>
+    <w:p>
+      <w:pPr>
+        <w:rPr>
+          <w:color w:val="1F497D" w:themeColor="text2"/>
+        </w:rPr>
+      </w:pPr>
+    </w:p>
+    <w:p>
+      <w:pPr>
+        <w:numPr>
+          <w:ilvl w:val="0"/>
+          <w:numId w:val="1"/>
+        </w:numPr>
+      </w:pPr>
+      <w:r>
+        <w:t>A supermarket wants to segment its customers based on their shopping patterns to provide personalized promotions.</w:t>
+      </w:r>
+      <w:r>
+        <w:br/>
+        <w:t xml:space="preserve"> </w:t>
+      </w:r>
+      <w:r>
+        <w:rPr>
+          <w:b/>
+        </w:rPr>
+        <w:t>Q:</w:t>
+      </w:r>
+      <w:r>
+        <w:t xml:space="preserve"> Identify the problem type and outline the step-by-step logic to solve it.</w:t>
+      </w:r>
+      <w:r>
+        <w:br/>
+      </w:r>
+      <w:r>
+        <w:rPr>
+          <w:b/>
+          <w:bCs/>
+          <w:color w:val="1F497D" w:themeColor="text2"/>
+        </w:rPr>
+        <w:t>Answer:</w:t>
+      </w:r>
+    </w:p>
+    <w:p>
+      <w:pPr>
+        <w:ind w:left="720"/>
+        <w:rPr>
+          <w:color w:val="1F497D" w:themeColor="text2"/>
+        </w:rPr>
+      </w:pPr>
+      <w:r>
+        <w:rPr>
+          <w:color w:val="1F497D" w:themeColor="text2"/>
+        </w:rPr>
+        <w:t xml:space="preserve">Problem Type: </w:t>
+      </w:r>
+    </w:p>
+    <w:p>
+      <w:pPr>
+        <w:ind w:left="720"/>
+        <w:rPr>
+          <w:color w:val="1F497D" w:themeColor="text2"/>
+        </w:rPr>
+      </w:pPr>
+      <w:r>
+        <w:rPr>
+          <w:color w:val="1F497D" w:themeColor="text2"/>
+        </w:rPr>
+        <w:t xml:space="preserve">step 1: Machine Learning </w:t>
+      </w:r>
+    </w:p>
+    <w:p>
+      <w:pPr>
+        <w:ind w:left="720"/>
+        <w:rPr>
+          <w:color w:val="1F497D" w:themeColor="text2"/>
+        </w:rPr>
+      </w:pPr>
+      <w:r>
+        <w:rPr>
+          <w:color w:val="1F497D" w:themeColor="text2"/>
+        </w:rPr>
+        <w:t xml:space="preserve">step 2: </w:t>
+      </w:r>
+      <w:r>
+        <w:rPr>
+          <w:color w:val="1F497D" w:themeColor="text2"/>
+        </w:rPr>
+        <w:t>Un</w:t>
+      </w:r>
+      <w:r>
+        <w:rPr>
+          <w:color w:val="1F497D" w:themeColor="text2"/>
+        </w:rPr>
+        <w:t xml:space="preserve">supervised Learning </w:t>
+      </w:r>
+    </w:p>
+    <w:p>
+      <w:pPr>
+        <w:ind w:left="720"/>
+        <w:rPr>
+          <w:color w:val="1F497D" w:themeColor="text2"/>
+        </w:rPr>
+      </w:pPr>
+      <w:r>
+        <w:rPr>
+          <w:color w:val="1F497D" w:themeColor="text2"/>
+        </w:rPr>
+        <w:t xml:space="preserve">step 3: Clustering </w:t>
+      </w:r>
+      <w:r>
+        <w:rPr>
+          <w:color w:val="1F497D" w:themeColor="text2"/>
+        </w:rPr>
+        <w:t xml:space="preserve">problem </w:t>
+      </w:r>
+    </w:p>
+    <w:p>
+      <w:pPr>
+        <w:ind w:left="720"/>
+        <w:rPr>
+          <w:color w:val="1F497D" w:themeColor="text2"/>
+        </w:rPr>
+      </w:pPr>
+    </w:p>
+    <w:p>
+      <w:pPr>
+        <w:ind w:left="720"/>
+        <w:rPr>
+          <w:color w:val="1F497D" w:themeColor="text2"/>
+        </w:rPr>
+      </w:pPr>
+      <w:r>
+        <w:rPr>
+          <w:color w:val="1F497D" w:themeColor="text2"/>
+        </w:rPr>
+        <w:t xml:space="preserve">Clustering Problem </w:t>
+      </w:r>
+    </w:p>
+    <w:p>
+      <w:pPr>
+        <w:ind w:left="720"/>
+        <w:rPr>
+          <w:color w:val="1F497D" w:themeColor="text2"/>
+        </w:rPr>
+      </w:pPr>
+      <w:r>
+        <w:rPr>
+          <w:color w:val="1F497D" w:themeColor="text2"/>
+        </w:rPr>
+        <w:t>Step by Step logic:</w:t>
       </w:r>
     </w:p>
     <w:p>
@@ -1110,6 +1658,174 @@
         <w:rPr>
           <w:color w:val="1F497D" w:themeColor="text2"/>
         </w:rPr>
+        <w:t xml:space="preserve">Load the </w:t>
+      </w:r>
+      <w:proofErr w:type="spellStart"/>
+      <w:r>
+        <w:rPr>
+          <w:color w:val="1F497D" w:themeColor="text2"/>
+        </w:rPr>
+        <w:t>supermarket_customer</w:t>
+      </w:r>
+      <w:proofErr w:type="spellEnd"/>
+      <w:r>
+        <w:rPr>
+          <w:color w:val="1F497D" w:themeColor="text2"/>
+        </w:rPr>
+        <w:t xml:space="preserve"> dataset</w:t>
+      </w:r>
+    </w:p>
+    <w:p>
+      <w:pPr>
+        <w:pStyle w:val="ListParagraph"/>
+        <w:numPr>
+          <w:ilvl w:val="0"/>
+          <w:numId w:val="3"/>
+        </w:numPr>
+        <w:rPr>
+          <w:color w:val="1F497D" w:themeColor="text2"/>
+        </w:rPr>
+      </w:pPr>
+      <w:r>
+        <w:rPr>
+          <w:color w:val="1F497D" w:themeColor="text2"/>
+        </w:rPr>
+        <w:t>Select the important features for X input data - (shopping patterns:- spending behavior, income, savings, age)</w:t>
+      </w:r>
+    </w:p>
+    <w:p>
+      <w:pPr>
+        <w:pStyle w:val="ListParagraph"/>
+        <w:numPr>
+          <w:ilvl w:val="0"/>
+          <w:numId w:val="3"/>
+        </w:numPr>
+        <w:rPr>
+          <w:color w:val="1F497D" w:themeColor="text2"/>
+        </w:rPr>
+      </w:pPr>
+      <w:r>
+        <w:rPr>
+          <w:color w:val="1F497D" w:themeColor="text2"/>
+        </w:rPr>
+        <w:t>Data preprocessing – Standardization</w:t>
+      </w:r>
+    </w:p>
+    <w:p>
+      <w:pPr>
+        <w:pStyle w:val="ListParagraph"/>
+        <w:numPr>
+          <w:ilvl w:val="0"/>
+          <w:numId w:val="3"/>
+        </w:numPr>
+        <w:rPr>
+          <w:color w:val="1F497D" w:themeColor="text2"/>
+        </w:rPr>
+      </w:pPr>
+      <w:r>
+        <w:rPr>
+          <w:color w:val="1F497D" w:themeColor="text2"/>
+        </w:rPr>
+        <w:t xml:space="preserve">Model creation &amp; prediction of </w:t>
+      </w:r>
+      <w:proofErr w:type="spellStart"/>
+      <w:r>
+        <w:rPr>
+          <w:color w:val="1F497D" w:themeColor="text2"/>
+        </w:rPr>
+        <w:t>Y_labels</w:t>
+      </w:r>
+      <w:proofErr w:type="spellEnd"/>
+      <w:r>
+        <w:rPr>
+          <w:color w:val="1F497D" w:themeColor="text2"/>
+        </w:rPr>
+        <w:t xml:space="preserve"> [cluster group] – (using clustering algorithms: K means, agglomerative, DBSCAN, optics, birch etc.) </w:t>
+      </w:r>
+    </w:p>
+    <w:p>
+      <w:pPr>
+        <w:pStyle w:val="ListParagraph"/>
+        <w:numPr>
+          <w:ilvl w:val="0"/>
+          <w:numId w:val="3"/>
+        </w:numPr>
+        <w:rPr>
+          <w:color w:val="1F497D" w:themeColor="text2"/>
+        </w:rPr>
+      </w:pPr>
+      <w:r>
+        <w:rPr>
+          <w:color w:val="1F497D" w:themeColor="text2"/>
+        </w:rPr>
+        <w:t xml:space="preserve">Create a new dataset with the cluster group &amp; save it as ‘cluster.csv’ file </w:t>
+      </w:r>
+    </w:p>
+    <w:p>
+      <w:pPr>
+        <w:pStyle w:val="ListParagraph"/>
+        <w:numPr>
+          <w:ilvl w:val="0"/>
+          <w:numId w:val="3"/>
+        </w:numPr>
+        <w:rPr>
+          <w:color w:val="1F497D" w:themeColor="text2"/>
+        </w:rPr>
+      </w:pPr>
+      <w:r>
+        <w:rPr>
+          <w:color w:val="1F497D" w:themeColor="text2"/>
+        </w:rPr>
+        <w:t xml:space="preserve">Visualize the clusters using </w:t>
+      </w:r>
+      <w:proofErr w:type="spellStart"/>
+      <w:r>
+        <w:rPr>
+          <w:color w:val="1F497D" w:themeColor="text2"/>
+        </w:rPr>
+        <w:t>seaborn.lmplot</w:t>
+      </w:r>
+      <w:proofErr w:type="spellEnd"/>
+      <w:r>
+        <w:rPr>
+          <w:color w:val="1F497D" w:themeColor="text2"/>
+        </w:rPr>
+        <w:t xml:space="preserve"> – (for visual inspection of clusters)</w:t>
+      </w:r>
+    </w:p>
+    <w:p>
+      <w:pPr>
+        <w:pStyle w:val="ListParagraph"/>
+        <w:numPr>
+          <w:ilvl w:val="0"/>
+          <w:numId w:val="3"/>
+        </w:numPr>
+        <w:rPr>
+          <w:color w:val="1F497D" w:themeColor="text2"/>
+        </w:rPr>
+      </w:pPr>
+      <w:r>
+        <w:rPr>
+          <w:color w:val="1F497D" w:themeColor="text2"/>
+        </w:rPr>
+        <w:t xml:space="preserve">Cluster model evaluation using cluster evaluation metrics </w:t>
+      </w:r>
+    </w:p>
+    <w:p>
+      <w:pPr>
+        <w:pStyle w:val="ListParagraph"/>
+        <w:numPr>
+          <w:ilvl w:val="0"/>
+          <w:numId w:val="3"/>
+        </w:numPr>
+        <w:rPr>
+          <w:color w:val="1F497D" w:themeColor="text2"/>
+        </w:rPr>
+      </w:pPr>
+      <w:r>
+        <w:rPr>
+          <w:color w:val="1F497D" w:themeColor="text2"/>
+        </w:rPr>
         <w:t xml:space="preserve">Finalize the best cluster model for the problem statement – (by analyzing the cluster outputs, evaluation metric, </w:t>
       </w:r>
       <w:r>
@@ -1128,6 +1844,11 @@
     <w:p>
       <w:pPr>
         <w:ind w:left="720"/>
+      </w:pPr>
+    </w:p>
+    <w:p>
+      <w:pPr>
+        <w:pStyle w:val="ListParagraph"/>
       </w:pPr>
     </w:p>
     <w:p>
@@ -1143,7 +1864,7 @@
         </w:numPr>
       </w:pPr>
       <w:r>
-        <w:t>A supermarket wants to segment its customers based on their shopping patterns to provide personalized promotions.</w:t>
+        <w:t>A company wants to estimate an employee’s salary based on their years of experience, job title, and education level.</w:t>
       </w:r>
       <w:r>
         <w:br/>
@@ -1172,6 +1893,20 @@
     </w:p>
     <w:p>
       <w:pPr>
+        <w:pStyle w:val="ListParagraph"/>
+        <w:rPr>
+          <w:color w:val="1F497D" w:themeColor="text2"/>
+        </w:rPr>
+      </w:pPr>
+      <w:r>
+        <w:rPr>
+          <w:color w:val="1F497D" w:themeColor="text2"/>
+        </w:rPr>
+        <w:t xml:space="preserve">Problem Type: </w:t>
+      </w:r>
+    </w:p>
+    <w:p>
+      <w:pPr>
         <w:ind w:left="720"/>
         <w:rPr>
           <w:color w:val="1F497D" w:themeColor="text2"/>
@@ -1181,8 +1916,1547 @@
         <w:rPr>
           <w:color w:val="1F497D" w:themeColor="text2"/>
         </w:rPr>
+        <w:t xml:space="preserve">step 1: Machine Learning </w:t>
+      </w:r>
+    </w:p>
+    <w:p>
+      <w:pPr>
+        <w:ind w:left="720"/>
+        <w:rPr>
+          <w:color w:val="1F497D" w:themeColor="text2"/>
+        </w:rPr>
+      </w:pPr>
+      <w:r>
+        <w:rPr>
+          <w:color w:val="1F497D" w:themeColor="text2"/>
+        </w:rPr>
+        <w:t xml:space="preserve">step 2: supervised Learning </w:t>
+      </w:r>
+    </w:p>
+    <w:p>
+      <w:pPr>
+        <w:ind w:left="720"/>
+        <w:rPr>
+          <w:color w:val="1F497D" w:themeColor="text2"/>
+        </w:rPr>
+      </w:pPr>
+      <w:r>
+        <w:rPr>
+          <w:color w:val="1F497D" w:themeColor="text2"/>
+        </w:rPr>
+        <w:t xml:space="preserve">step 3: Regression </w:t>
+      </w:r>
+      <w:r>
+        <w:rPr>
+          <w:color w:val="1F497D" w:themeColor="text2"/>
+        </w:rPr>
+        <w:t xml:space="preserve">problem </w:t>
+      </w:r>
+    </w:p>
+    <w:p>
+      <w:pPr>
+        <w:pStyle w:val="ListParagraph"/>
+        <w:rPr>
+          <w:color w:val="1F497D" w:themeColor="text2"/>
+        </w:rPr>
+      </w:pPr>
+    </w:p>
+    <w:p>
+      <w:pPr>
+        <w:pStyle w:val="ListParagraph"/>
+        <w:rPr>
+          <w:color w:val="1F497D" w:themeColor="text2"/>
+        </w:rPr>
+      </w:pPr>
+      <w:r>
+        <w:rPr>
+          <w:color w:val="1F497D" w:themeColor="text2"/>
+        </w:rPr>
+        <w:t xml:space="preserve">Regression </w:t>
+      </w:r>
+      <w:r>
+        <w:rPr>
+          <w:color w:val="1F497D" w:themeColor="text2"/>
+        </w:rPr>
+        <w:t xml:space="preserve">Problem </w:t>
+      </w:r>
+    </w:p>
+    <w:p>
+      <w:pPr>
+        <w:pStyle w:val="ListParagraph"/>
+        <w:rPr>
+          <w:color w:val="1F497D" w:themeColor="text2"/>
+        </w:rPr>
+      </w:pPr>
+      <w:r>
+        <w:rPr>
+          <w:color w:val="1F497D" w:themeColor="text2"/>
+        </w:rPr>
+        <w:t>Step by Step logic:</w:t>
+      </w:r>
+    </w:p>
+    <w:p>
+      <w:pPr>
+        <w:pStyle w:val="ListParagraph"/>
+        <w:numPr>
+          <w:ilvl w:val="1"/>
+          <w:numId w:val="2"/>
+        </w:numPr>
+        <w:rPr>
+          <w:color w:val="1F497D" w:themeColor="text2"/>
+        </w:rPr>
+      </w:pPr>
+      <w:r>
+        <w:rPr>
+          <w:color w:val="1F497D" w:themeColor="text2"/>
+        </w:rPr>
+        <w:t xml:space="preserve">Load the </w:t>
+      </w:r>
+      <w:proofErr w:type="spellStart"/>
+      <w:r>
+        <w:rPr>
+          <w:color w:val="1F497D" w:themeColor="text2"/>
+        </w:rPr>
+        <w:t>company_emplyees</w:t>
+      </w:r>
+      <w:proofErr w:type="spellEnd"/>
+      <w:r>
+        <w:rPr>
+          <w:color w:val="1F497D" w:themeColor="text2"/>
+        </w:rPr>
+        <w:t xml:space="preserve"> dataset</w:t>
+      </w:r>
+    </w:p>
+    <w:p>
+      <w:pPr>
+        <w:pStyle w:val="ListParagraph"/>
+        <w:numPr>
+          <w:ilvl w:val="1"/>
+          <w:numId w:val="2"/>
+        </w:numPr>
+      </w:pPr>
+      <w:r>
+        <w:rPr>
+          <w:color w:val="1F497D" w:themeColor="text2"/>
+        </w:rPr>
+        <w:t>Convert the categorical data (</w:t>
+      </w:r>
+      <w:proofErr w:type="spellStart"/>
+      <w:r>
+        <w:rPr>
+          <w:color w:val="1F497D" w:themeColor="text2"/>
+        </w:rPr>
+        <w:t>job_title</w:t>
+      </w:r>
+      <w:proofErr w:type="spellEnd"/>
+      <w:r>
+        <w:rPr>
+          <w:color w:val="1F497D" w:themeColor="text2"/>
+        </w:rPr>
+        <w:t xml:space="preserve">, </w:t>
+      </w:r>
+      <w:proofErr w:type="spellStart"/>
+      <w:r>
+        <w:rPr>
+          <w:color w:val="1F497D" w:themeColor="text2"/>
+        </w:rPr>
+        <w:t>educational_level</w:t>
+      </w:r>
+      <w:proofErr w:type="spellEnd"/>
+      <w:r>
+        <w:rPr>
+          <w:color w:val="1F497D" w:themeColor="text2"/>
+        </w:rPr>
+        <w:t xml:space="preserve"> column) into numerical data using </w:t>
+      </w:r>
+      <w:proofErr w:type="spellStart"/>
+      <w:r>
+        <w:rPr>
+          <w:color w:val="1F497D" w:themeColor="text2"/>
+        </w:rPr>
+        <w:t>pd.get_dummies</w:t>
+      </w:r>
+      <w:proofErr w:type="spellEnd"/>
+    </w:p>
+    <w:p>
+      <w:pPr>
+        <w:pStyle w:val="ListParagraph"/>
+        <w:numPr>
+          <w:ilvl w:val="1"/>
+          <w:numId w:val="2"/>
+        </w:numPr>
+      </w:pPr>
+      <w:r>
+        <w:rPr>
+          <w:color w:val="1F497D" w:themeColor="text2"/>
+        </w:rPr>
+        <w:lastRenderedPageBreak/>
+        <w:t>Split input</w:t>
+      </w:r>
+      <w:r>
+        <w:rPr>
+          <w:color w:val="1F497D" w:themeColor="text2"/>
+        </w:rPr>
+        <w:t xml:space="preserve"> (</w:t>
+      </w:r>
+      <w:proofErr w:type="spellStart"/>
+      <w:r>
+        <w:rPr>
+          <w:color w:val="1F497D" w:themeColor="text2"/>
+        </w:rPr>
+        <w:t>years_of_experience</w:t>
+      </w:r>
+      <w:proofErr w:type="spellEnd"/>
+      <w:r>
+        <w:rPr>
+          <w:color w:val="1F497D" w:themeColor="text2"/>
+        </w:rPr>
+        <w:t xml:space="preserve">, </w:t>
+      </w:r>
+      <w:proofErr w:type="spellStart"/>
+      <w:r>
+        <w:rPr>
+          <w:color w:val="1F497D" w:themeColor="text2"/>
+        </w:rPr>
+        <w:t>job_title</w:t>
+      </w:r>
+      <w:proofErr w:type="spellEnd"/>
+      <w:r>
+        <w:rPr>
+          <w:color w:val="1F497D" w:themeColor="text2"/>
+        </w:rPr>
+        <w:t xml:space="preserve">, </w:t>
+      </w:r>
+      <w:proofErr w:type="spellStart"/>
+      <w:r>
+        <w:rPr>
+          <w:color w:val="1F497D" w:themeColor="text2"/>
+        </w:rPr>
+        <w:t>education_level</w:t>
+      </w:r>
+      <w:proofErr w:type="spellEnd"/>
+      <w:r>
+        <w:rPr>
+          <w:color w:val="1F497D" w:themeColor="text2"/>
+        </w:rPr>
+        <w:t>)</w:t>
+      </w:r>
+      <w:r>
+        <w:rPr>
+          <w:color w:val="1F497D" w:themeColor="text2"/>
+        </w:rPr>
+        <w:t xml:space="preserve"> and output</w:t>
+      </w:r>
+      <w:r>
+        <w:rPr>
+          <w:color w:val="1F497D" w:themeColor="text2"/>
+        </w:rPr>
+        <w:t xml:space="preserve"> (</w:t>
+      </w:r>
+      <w:proofErr w:type="spellStart"/>
+      <w:r>
+        <w:rPr>
+          <w:color w:val="1F497D" w:themeColor="text2"/>
+        </w:rPr>
+        <w:t>employee_salary</w:t>
+      </w:r>
+      <w:proofErr w:type="spellEnd"/>
+      <w:r>
+        <w:rPr>
+          <w:color w:val="1F497D" w:themeColor="text2"/>
+        </w:rPr>
+        <w:t>)</w:t>
+      </w:r>
+    </w:p>
+    <w:p>
+      <w:pPr>
+        <w:pStyle w:val="ListParagraph"/>
+        <w:numPr>
+          <w:ilvl w:val="1"/>
+          <w:numId w:val="2"/>
+        </w:numPr>
+      </w:pPr>
+      <w:r>
+        <w:rPr>
+          <w:color w:val="1F497D" w:themeColor="text2"/>
+        </w:rPr>
+        <w:t>Split train and test dataset</w:t>
+      </w:r>
+    </w:p>
+    <w:p>
+      <w:pPr>
+        <w:pStyle w:val="ListParagraph"/>
+        <w:numPr>
+          <w:ilvl w:val="1"/>
+          <w:numId w:val="2"/>
+        </w:numPr>
+      </w:pPr>
+      <w:r>
+        <w:rPr>
+          <w:color w:val="1F497D" w:themeColor="text2"/>
+        </w:rPr>
+        <w:t xml:space="preserve">Model creation using regression algorithms (linear regression, SVR, decision tree, random forest, boosting </w:t>
+      </w:r>
+      <w:proofErr w:type="spellStart"/>
+      <w:r>
+        <w:rPr>
+          <w:color w:val="1F497D" w:themeColor="text2"/>
+        </w:rPr>
+        <w:t>etc</w:t>
+      </w:r>
+      <w:proofErr w:type="spellEnd"/>
+      <w:r>
+        <w:rPr>
+          <w:color w:val="1F497D" w:themeColor="text2"/>
+        </w:rPr>
+        <w:t>…)</w:t>
+      </w:r>
+    </w:p>
+    <w:p>
+      <w:pPr>
+        <w:pStyle w:val="ListParagraph"/>
+        <w:numPr>
+          <w:ilvl w:val="1"/>
+          <w:numId w:val="2"/>
+        </w:numPr>
+      </w:pPr>
+      <w:r>
+        <w:rPr>
+          <w:color w:val="1F497D" w:themeColor="text2"/>
+        </w:rPr>
+        <w:t>Test the model prediction</w:t>
+      </w:r>
+    </w:p>
+    <w:p>
+      <w:pPr>
+        <w:pStyle w:val="ListParagraph"/>
+        <w:numPr>
+          <w:ilvl w:val="1"/>
+          <w:numId w:val="2"/>
+        </w:numPr>
+      </w:pPr>
+      <w:r>
+        <w:rPr>
+          <w:color w:val="1F497D" w:themeColor="text2"/>
+        </w:rPr>
+        <w:t xml:space="preserve">Evaluate the model using r2_score </w:t>
+      </w:r>
+    </w:p>
+    <w:p>
+      <w:pPr>
+        <w:pStyle w:val="ListParagraph"/>
+        <w:rPr>
+          <w:color w:val="1F497D" w:themeColor="text2"/>
+        </w:rPr>
+      </w:pPr>
+      <w:r>
+        <w:rPr>
+          <w:color w:val="1F497D" w:themeColor="text2"/>
+        </w:rPr>
+        <w:t>Finalize the best model (by comparing all algorithm performance for the dataset)</w:t>
+      </w:r>
+    </w:p>
+    <w:p>
+      <w:pPr>
+        <w:ind w:left="720"/>
+      </w:pPr>
+    </w:p>
+    <w:p/>
+    <w:p>
+      <w:pPr>
+        <w:numPr>
+          <w:ilvl w:val="0"/>
+          <w:numId w:val="1"/>
+        </w:numPr>
+      </w:pPr>
+      <w:r>
+        <w:t>An email provider wants to automatically classify incoming emails as spam or not spam based on their content and sender details.</w:t>
+      </w:r>
+      <w:r>
+        <w:br/>
+        <w:t xml:space="preserve"> </w:t>
+      </w:r>
+      <w:r>
+        <w:rPr>
+          <w:b/>
+        </w:rPr>
+        <w:t>Q:</w:t>
+      </w:r>
+      <w:r>
+        <w:t xml:space="preserve"> Identify the problem type and outline the step-by-step logic to solve it.</w:t>
+      </w:r>
+      <w:r>
+        <w:br/>
+      </w:r>
+      <w:r>
+        <w:rPr>
+          <w:b/>
+          <w:bCs/>
+          <w:color w:val="1F497D" w:themeColor="text2"/>
+        </w:rPr>
+        <w:t>Answer:</w:t>
+      </w:r>
+    </w:p>
+    <w:p>
+      <w:pPr>
+        <w:pStyle w:val="ListParagraph"/>
+        <w:rPr>
+          <w:color w:val="1F497D" w:themeColor="text2"/>
+        </w:rPr>
+      </w:pPr>
+      <w:r>
+        <w:rPr>
+          <w:color w:val="1F497D" w:themeColor="text2"/>
+        </w:rPr>
         <w:t xml:space="preserve">Problem Type: </w:t>
       </w:r>
+    </w:p>
+    <w:p>
+      <w:pPr>
+        <w:ind w:left="720"/>
+        <w:rPr>
+          <w:color w:val="1F497D" w:themeColor="text2"/>
+        </w:rPr>
+      </w:pPr>
+      <w:r>
+        <w:rPr>
+          <w:color w:val="1F497D" w:themeColor="text2"/>
+        </w:rPr>
+        <w:t xml:space="preserve">step 1: </w:t>
+      </w:r>
+      <w:r>
+        <w:rPr>
+          <w:color w:val="1F497D" w:themeColor="text2"/>
+        </w:rPr>
+        <w:t>NLP</w:t>
+      </w:r>
+      <w:r>
+        <w:rPr>
+          <w:color w:val="1F497D" w:themeColor="text2"/>
+        </w:rPr>
+        <w:t xml:space="preserve">/ML </w:t>
+      </w:r>
+    </w:p>
+    <w:p>
+      <w:pPr>
+        <w:ind w:left="720"/>
+        <w:rPr>
+          <w:color w:val="1F497D" w:themeColor="text2"/>
+        </w:rPr>
+      </w:pPr>
+      <w:r>
+        <w:rPr>
+          <w:color w:val="1F497D" w:themeColor="text2"/>
+        </w:rPr>
+        <w:t xml:space="preserve">step 2: supervised Learning </w:t>
+      </w:r>
+    </w:p>
+    <w:p>
+      <w:pPr>
+        <w:ind w:left="720"/>
+        <w:rPr>
+          <w:color w:val="1F497D" w:themeColor="text2"/>
+        </w:rPr>
+      </w:pPr>
+      <w:r>
+        <w:rPr>
+          <w:color w:val="1F497D" w:themeColor="text2"/>
+        </w:rPr>
+        <w:t xml:space="preserve">step 3: Classification </w:t>
+      </w:r>
+      <w:r>
+        <w:rPr>
+          <w:color w:val="1F497D" w:themeColor="text2"/>
+        </w:rPr>
+        <w:t xml:space="preserve">problem </w:t>
+      </w:r>
+    </w:p>
+    <w:p>
+      <w:pPr>
+        <w:pStyle w:val="ListParagraph"/>
+        <w:rPr>
+          <w:color w:val="1F497D" w:themeColor="text2"/>
+        </w:rPr>
+      </w:pPr>
+    </w:p>
+    <w:p>
+      <w:pPr>
+        <w:pStyle w:val="ListParagraph"/>
+        <w:rPr>
+          <w:color w:val="1F497D" w:themeColor="text2"/>
+        </w:rPr>
+      </w:pPr>
+      <w:r>
+        <w:rPr>
+          <w:color w:val="1F497D" w:themeColor="text2"/>
+        </w:rPr>
+        <w:t xml:space="preserve">Classification </w:t>
+      </w:r>
+      <w:r>
+        <w:rPr>
+          <w:color w:val="1F497D" w:themeColor="text2"/>
+        </w:rPr>
+        <w:t xml:space="preserve">Problem </w:t>
+      </w:r>
+    </w:p>
+    <w:p>
+      <w:pPr>
+        <w:pStyle w:val="ListParagraph"/>
+        <w:rPr>
+          <w:color w:val="1F497D" w:themeColor="text2"/>
+        </w:rPr>
+      </w:pPr>
+      <w:r>
+        <w:rPr>
+          <w:color w:val="1F497D" w:themeColor="text2"/>
+        </w:rPr>
+        <w:t>Step by Step logic:</w:t>
+      </w:r>
+    </w:p>
+    <w:p>
+      <w:pPr>
+        <w:pStyle w:val="ListParagraph"/>
+        <w:numPr>
+          <w:ilvl w:val="0"/>
+          <w:numId w:val="4"/>
+        </w:numPr>
+        <w:rPr>
+          <w:color w:val="1F497D" w:themeColor="text2"/>
+        </w:rPr>
+      </w:pPr>
+      <w:r>
+        <w:rPr>
+          <w:color w:val="1F497D" w:themeColor="text2"/>
+        </w:rPr>
+        <w:t xml:space="preserve">Load the </w:t>
+      </w:r>
+      <w:proofErr w:type="spellStart"/>
+      <w:r>
+        <w:rPr>
+          <w:color w:val="1F497D" w:themeColor="text2"/>
+        </w:rPr>
+        <w:t>email_dataset</w:t>
+      </w:r>
+      <w:proofErr w:type="spellEnd"/>
+    </w:p>
+    <w:p>
+      <w:pPr>
+        <w:pStyle w:val="ListParagraph"/>
+        <w:numPr>
+          <w:ilvl w:val="0"/>
+          <w:numId w:val="4"/>
+        </w:numPr>
+        <w:rPr>
+          <w:color w:val="1F497D" w:themeColor="text2"/>
+        </w:rPr>
+      </w:pPr>
+      <w:r>
+        <w:rPr>
+          <w:color w:val="1F497D" w:themeColor="text2"/>
+        </w:rPr>
+        <w:t>Split input (</w:t>
+      </w:r>
+      <w:proofErr w:type="spellStart"/>
+      <w:r>
+        <w:rPr>
+          <w:color w:val="1F497D" w:themeColor="text2"/>
+        </w:rPr>
+        <w:t>message_content</w:t>
+      </w:r>
+      <w:proofErr w:type="spellEnd"/>
+      <w:r>
+        <w:rPr>
+          <w:color w:val="1F497D" w:themeColor="text2"/>
+        </w:rPr>
+        <w:t xml:space="preserve">, </w:t>
+      </w:r>
+      <w:proofErr w:type="spellStart"/>
+      <w:r>
+        <w:rPr>
+          <w:color w:val="1F497D" w:themeColor="text2"/>
+        </w:rPr>
+        <w:t>sender_details</w:t>
+      </w:r>
+      <w:proofErr w:type="spellEnd"/>
+      <w:r>
+        <w:rPr>
+          <w:color w:val="1F497D" w:themeColor="text2"/>
+        </w:rPr>
+        <w:t>) and output (</w:t>
+      </w:r>
+      <w:proofErr w:type="spellStart"/>
+      <w:r>
+        <w:rPr>
+          <w:color w:val="1F497D" w:themeColor="text2"/>
+        </w:rPr>
+        <w:t>email_classify</w:t>
+      </w:r>
+      <w:proofErr w:type="spellEnd"/>
+      <w:r>
+        <w:rPr>
+          <w:color w:val="1F497D" w:themeColor="text2"/>
+        </w:rPr>
+        <w:t>)</w:t>
+      </w:r>
+    </w:p>
+    <w:p>
+      <w:pPr>
+        <w:pStyle w:val="ListParagraph"/>
+        <w:numPr>
+          <w:ilvl w:val="0"/>
+          <w:numId w:val="4"/>
+        </w:numPr>
+        <w:rPr>
+          <w:color w:val="1F497D" w:themeColor="text2"/>
+        </w:rPr>
+      </w:pPr>
+      <w:r>
+        <w:rPr>
+          <w:color w:val="1F497D" w:themeColor="text2"/>
+        </w:rPr>
+        <w:t>Split train &amp; test dataset</w:t>
+      </w:r>
+    </w:p>
+    <w:p>
+      <w:pPr>
+        <w:pStyle w:val="ListParagraph"/>
+        <w:numPr>
+          <w:ilvl w:val="0"/>
+          <w:numId w:val="4"/>
+        </w:numPr>
+        <w:rPr>
+          <w:color w:val="1F497D" w:themeColor="text2"/>
+        </w:rPr>
+      </w:pPr>
+      <w:r>
+        <w:rPr>
+          <w:color w:val="1F497D" w:themeColor="text2"/>
+        </w:rPr>
+        <w:t>Model creation using classification algorithms.</w:t>
+      </w:r>
+    </w:p>
+    <w:p>
+      <w:pPr>
+        <w:rPr>
+          <w:color w:val="1F497D" w:themeColor="text2"/>
+        </w:rPr>
+      </w:pPr>
+      <w:r>
+        <w:rPr>
+          <w:color w:val="1F497D" w:themeColor="text2"/>
+        </w:rPr>
+        <w:t>Must try</w:t>
+      </w:r>
+      <w:r>
+        <w:rPr>
+          <w:color w:val="1F497D" w:themeColor="text2"/>
+        </w:rPr>
+        <w:t xml:space="preserve"> algorithm</w:t>
+      </w:r>
+      <w:r>
+        <w:rPr>
+          <w:color w:val="1F497D" w:themeColor="text2"/>
+        </w:rPr>
+        <w:t>: Naïve bayes – multinomial (good for detecting the spam or not spam emails as it works by computing the text occurrence count)</w:t>
+      </w:r>
+    </w:p>
+    <w:p>
+      <w:pPr>
+        <w:pStyle w:val="ListParagraph"/>
+        <w:ind w:left="1440"/>
+        <w:rPr>
+          <w:color w:val="1F497D" w:themeColor="text2"/>
+        </w:rPr>
+      </w:pPr>
+    </w:p>
+    <w:p>
+      <w:pPr>
+        <w:pStyle w:val="ListParagraph"/>
+        <w:numPr>
+          <w:ilvl w:val="0"/>
+          <w:numId w:val="4"/>
+        </w:numPr>
+        <w:rPr>
+          <w:color w:val="1F497D" w:themeColor="text2"/>
+        </w:rPr>
+      </w:pPr>
+      <w:r>
+        <w:rPr>
+          <w:color w:val="1F497D" w:themeColor="text2"/>
+        </w:rPr>
+        <w:t xml:space="preserve">Test the model </w:t>
+      </w:r>
+    </w:p>
+    <w:p>
+      <w:pPr>
+        <w:pStyle w:val="ListParagraph"/>
+        <w:numPr>
+          <w:ilvl w:val="0"/>
+          <w:numId w:val="4"/>
+        </w:numPr>
+        <w:rPr>
+          <w:color w:val="1F497D" w:themeColor="text2"/>
+        </w:rPr>
+      </w:pPr>
+      <w:r>
+        <w:rPr>
+          <w:color w:val="1F497D" w:themeColor="text2"/>
+        </w:rPr>
+        <w:t xml:space="preserve">Model evaluation using confusion matrix &amp; classification report </w:t>
+      </w:r>
+    </w:p>
+    <w:p>
+      <w:pPr>
+        <w:pStyle w:val="ListParagraph"/>
+        <w:numPr>
+          <w:ilvl w:val="0"/>
+          <w:numId w:val="4"/>
+        </w:numPr>
+        <w:rPr>
+          <w:color w:val="1F497D" w:themeColor="text2"/>
+        </w:rPr>
+      </w:pPr>
+      <w:r>
+        <w:rPr>
+          <w:color w:val="1F497D" w:themeColor="text2"/>
+        </w:rPr>
+        <w:t>Finalize the best model for the Email classification of spam or not based on the performance analyses from confusion matrix &amp; classification report of all algorithms</w:t>
+      </w:r>
+    </w:p>
+    <w:p>
+      <w:pPr>
+        <w:rPr>
+          <w:color w:val="1F497D" w:themeColor="text2"/>
+        </w:rPr>
+      </w:pPr>
+    </w:p>
+    <w:p>
+      <w:pPr>
+        <w:rPr>
+          <w:color w:val="1F497D" w:themeColor="text2"/>
+        </w:rPr>
+      </w:pPr>
+    </w:p>
+    <w:p>
+      <w:pPr>
+        <w:ind w:left="720"/>
+      </w:pPr>
+    </w:p>
+    <w:p/>
+    <w:p>
+      <w:pPr>
+        <w:numPr>
+          <w:ilvl w:val="0"/>
+          <w:numId w:val="1"/>
+        </w:numPr>
+      </w:pPr>
+      <w:r>
+        <w:t>A business wants to analyze customer reviews of its products and determine whether the sentiment is positive or negative.</w:t>
+      </w:r>
+      <w:r>
+        <w:br/>
+        <w:t xml:space="preserve"> </w:t>
+      </w:r>
+      <w:r>
+        <w:rPr>
+          <w:b/>
+        </w:rPr>
+        <w:t>Q:</w:t>
+      </w:r>
+      <w:r>
+        <w:t xml:space="preserve"> Identify the problem type and outline the step-by-step logic to solve it.</w:t>
+      </w:r>
+      <w:r>
+        <w:br/>
+      </w:r>
+      <w:r>
+        <w:rPr>
+          <w:b/>
+          <w:bCs/>
+          <w:color w:val="1F497D" w:themeColor="text2"/>
+        </w:rPr>
+        <w:t>Answer:</w:t>
+      </w:r>
+    </w:p>
+    <w:p>
+      <w:pPr>
+        <w:pStyle w:val="ListParagraph"/>
+        <w:rPr>
+          <w:color w:val="1F497D" w:themeColor="text2"/>
+        </w:rPr>
+      </w:pPr>
+      <w:r>
+        <w:rPr>
+          <w:color w:val="1F497D" w:themeColor="text2"/>
+        </w:rPr>
+        <w:t xml:space="preserve">Problem Type: </w:t>
+      </w:r>
+    </w:p>
+    <w:p>
+      <w:pPr>
+        <w:ind w:left="720"/>
+        <w:rPr>
+          <w:color w:val="1F497D" w:themeColor="text2"/>
+        </w:rPr>
+      </w:pPr>
+      <w:r>
+        <w:rPr>
+          <w:color w:val="1F497D" w:themeColor="text2"/>
+        </w:rPr>
+        <w:t xml:space="preserve">step 1: </w:t>
+      </w:r>
+      <w:r>
+        <w:rPr>
+          <w:color w:val="1F497D" w:themeColor="text2"/>
+        </w:rPr>
+        <w:t>NLP</w:t>
+      </w:r>
+      <w:r>
+        <w:rPr>
+          <w:color w:val="1F497D" w:themeColor="text2"/>
+        </w:rPr>
+        <w:t>/ML</w:t>
+      </w:r>
+    </w:p>
+    <w:p>
+      <w:pPr>
+        <w:ind w:left="720"/>
+        <w:rPr>
+          <w:color w:val="1F497D" w:themeColor="text2"/>
+        </w:rPr>
+      </w:pPr>
+      <w:r>
+        <w:rPr>
+          <w:color w:val="1F497D" w:themeColor="text2"/>
+        </w:rPr>
+        <w:t xml:space="preserve">step 2: supervised Learning </w:t>
+      </w:r>
+    </w:p>
+    <w:p>
+      <w:pPr>
+        <w:ind w:left="720"/>
+        <w:rPr>
+          <w:color w:val="1F497D" w:themeColor="text2"/>
+        </w:rPr>
+      </w:pPr>
+      <w:r>
+        <w:rPr>
+          <w:color w:val="1F497D" w:themeColor="text2"/>
+        </w:rPr>
+        <w:lastRenderedPageBreak/>
+        <w:t xml:space="preserve">step 3: Classification </w:t>
+      </w:r>
+      <w:r>
+        <w:rPr>
+          <w:color w:val="1F497D" w:themeColor="text2"/>
+        </w:rPr>
+        <w:t xml:space="preserve">problem </w:t>
+      </w:r>
+    </w:p>
+    <w:p>
+      <w:pPr>
+        <w:pStyle w:val="ListParagraph"/>
+        <w:rPr>
+          <w:color w:val="1F497D" w:themeColor="text2"/>
+        </w:rPr>
+      </w:pPr>
+    </w:p>
+    <w:p>
+      <w:pPr>
+        <w:pStyle w:val="ListParagraph"/>
+        <w:rPr>
+          <w:color w:val="1F497D" w:themeColor="text2"/>
+        </w:rPr>
+      </w:pPr>
+      <w:r>
+        <w:rPr>
+          <w:color w:val="1F497D" w:themeColor="text2"/>
+        </w:rPr>
+        <w:t xml:space="preserve">Classification </w:t>
+      </w:r>
+      <w:r>
+        <w:rPr>
+          <w:color w:val="1F497D" w:themeColor="text2"/>
+        </w:rPr>
+        <w:t xml:space="preserve">Problem </w:t>
+      </w:r>
+    </w:p>
+    <w:p>
+      <w:pPr>
+        <w:pStyle w:val="ListParagraph"/>
+        <w:rPr>
+          <w:color w:val="1F497D" w:themeColor="text2"/>
+        </w:rPr>
+      </w:pPr>
+      <w:r>
+        <w:rPr>
+          <w:color w:val="1F497D" w:themeColor="text2"/>
+        </w:rPr>
+        <w:t>Step by Step logic:</w:t>
+      </w:r>
+    </w:p>
+    <w:p>
+      <w:pPr>
+        <w:pStyle w:val="ListParagraph"/>
+        <w:numPr>
+          <w:ilvl w:val="0"/>
+          <w:numId w:val="5"/>
+        </w:numPr>
+        <w:rPr>
+          <w:color w:val="1F497D" w:themeColor="text2"/>
+        </w:rPr>
+      </w:pPr>
+      <w:r>
+        <w:rPr>
+          <w:color w:val="1F497D" w:themeColor="text2"/>
+        </w:rPr>
+        <w:t xml:space="preserve">Load the </w:t>
+      </w:r>
+      <w:proofErr w:type="spellStart"/>
+      <w:r>
+        <w:rPr>
+          <w:color w:val="1F497D" w:themeColor="text2"/>
+        </w:rPr>
+        <w:t>customer_reviews</w:t>
+      </w:r>
+      <w:proofErr w:type="spellEnd"/>
+      <w:r>
+        <w:rPr>
+          <w:color w:val="1F497D" w:themeColor="text2"/>
+        </w:rPr>
+        <w:t xml:space="preserve"> dataset</w:t>
+      </w:r>
+    </w:p>
+    <w:p>
+      <w:pPr>
+        <w:pStyle w:val="ListParagraph"/>
+        <w:numPr>
+          <w:ilvl w:val="0"/>
+          <w:numId w:val="5"/>
+        </w:numPr>
+        <w:rPr>
+          <w:color w:val="1F497D" w:themeColor="text2"/>
+        </w:rPr>
+      </w:pPr>
+      <w:r>
+        <w:rPr>
+          <w:color w:val="1F497D" w:themeColor="text2"/>
+        </w:rPr>
+        <w:t>Split input (</w:t>
+      </w:r>
+      <w:proofErr w:type="spellStart"/>
+      <w:r>
+        <w:rPr>
+          <w:color w:val="1F497D" w:themeColor="text2"/>
+        </w:rPr>
+        <w:t>customer_reviews</w:t>
+      </w:r>
+      <w:proofErr w:type="spellEnd"/>
+      <w:r>
+        <w:rPr>
+          <w:color w:val="1F497D" w:themeColor="text2"/>
+        </w:rPr>
+        <w:t>) and output (sentiment- positive/negative)</w:t>
+      </w:r>
+    </w:p>
+    <w:p>
+      <w:pPr>
+        <w:pStyle w:val="ListParagraph"/>
+        <w:numPr>
+          <w:ilvl w:val="0"/>
+          <w:numId w:val="5"/>
+        </w:numPr>
+        <w:rPr>
+          <w:color w:val="1F497D" w:themeColor="text2"/>
+        </w:rPr>
+      </w:pPr>
+      <w:r>
+        <w:rPr>
+          <w:color w:val="1F497D" w:themeColor="text2"/>
+        </w:rPr>
+        <w:t>Split train and test dataset</w:t>
+      </w:r>
+    </w:p>
+    <w:p>
+      <w:pPr>
+        <w:pStyle w:val="ListParagraph"/>
+        <w:numPr>
+          <w:ilvl w:val="0"/>
+          <w:numId w:val="5"/>
+        </w:numPr>
+        <w:rPr>
+          <w:color w:val="1F497D" w:themeColor="text2"/>
+        </w:rPr>
+      </w:pPr>
+      <w:r>
+        <w:rPr>
+          <w:color w:val="1F497D" w:themeColor="text2"/>
+        </w:rPr>
+        <w:t>Model creation using classification algorithms.</w:t>
+      </w:r>
+    </w:p>
+    <w:p>
+      <w:pPr>
+        <w:rPr>
+          <w:color w:val="1F497D" w:themeColor="text2"/>
+        </w:rPr>
+      </w:pPr>
+      <w:r>
+        <w:rPr>
+          <w:color w:val="1F497D" w:themeColor="text2"/>
+        </w:rPr>
+        <w:t>Must try</w:t>
+      </w:r>
+      <w:r>
+        <w:rPr>
+          <w:color w:val="1F497D" w:themeColor="text2"/>
+        </w:rPr>
+        <w:t xml:space="preserve"> algorithm</w:t>
+      </w:r>
+      <w:r>
+        <w:rPr>
+          <w:color w:val="1F497D" w:themeColor="text2"/>
+        </w:rPr>
+        <w:t>: Naïve bayes – multinomial (good for detecting the positive &amp; negative</w:t>
+      </w:r>
+      <w:r>
+        <w:rPr>
+          <w:color w:val="1F497D" w:themeColor="text2"/>
+        </w:rPr>
+        <w:t xml:space="preserve"> customer sentiment </w:t>
+      </w:r>
+      <w:r>
+        <w:rPr>
+          <w:color w:val="1F497D" w:themeColor="text2"/>
+        </w:rPr>
+        <w:t>as it works by computing the text occurrence count)</w:t>
+      </w:r>
+    </w:p>
+    <w:p>
+      <w:pPr>
+        <w:pStyle w:val="ListParagraph"/>
+        <w:numPr>
+          <w:ilvl w:val="0"/>
+          <w:numId w:val="5"/>
+        </w:numPr>
+        <w:rPr>
+          <w:color w:val="1F497D" w:themeColor="text2"/>
+        </w:rPr>
+      </w:pPr>
+      <w:r>
+        <w:rPr>
+          <w:color w:val="1F497D" w:themeColor="text2"/>
+        </w:rPr>
+        <w:t xml:space="preserve">Test the model </w:t>
+      </w:r>
+    </w:p>
+    <w:p>
+      <w:pPr>
+        <w:pStyle w:val="ListParagraph"/>
+        <w:numPr>
+          <w:ilvl w:val="0"/>
+          <w:numId w:val="5"/>
+        </w:numPr>
+        <w:rPr>
+          <w:color w:val="1F497D" w:themeColor="text2"/>
+        </w:rPr>
+      </w:pPr>
+      <w:r>
+        <w:rPr>
+          <w:color w:val="1F497D" w:themeColor="text2"/>
+        </w:rPr>
+        <w:t xml:space="preserve">Model evaluation using confusion matrix &amp; classification report </w:t>
+      </w:r>
+    </w:p>
+    <w:p>
+      <w:pPr>
+        <w:pStyle w:val="ListParagraph"/>
+        <w:numPr>
+          <w:ilvl w:val="0"/>
+          <w:numId w:val="5"/>
+        </w:numPr>
+        <w:rPr>
+          <w:color w:val="1F497D" w:themeColor="text2"/>
+        </w:rPr>
+      </w:pPr>
+      <w:r>
+        <w:rPr>
+          <w:color w:val="1F497D" w:themeColor="text2"/>
+        </w:rPr>
+        <w:t xml:space="preserve">Finalize the best model for the </w:t>
+      </w:r>
+      <w:r>
+        <w:rPr>
+          <w:color w:val="1F497D" w:themeColor="text2"/>
+        </w:rPr>
+        <w:t xml:space="preserve">customer review sentiment analysis </w:t>
+      </w:r>
+      <w:r>
+        <w:rPr>
+          <w:color w:val="1F497D" w:themeColor="text2"/>
+        </w:rPr>
+        <w:t>on the performance analyses from confusion matrix &amp; classification report of all algorithms</w:t>
+      </w:r>
+    </w:p>
+    <w:p>
+      <w:pPr>
+        <w:ind w:left="720"/>
+      </w:pPr>
+    </w:p>
+    <w:p>
+      <w:pPr>
+        <w:pStyle w:val="ListParagraph"/>
+      </w:pPr>
+    </w:p>
+    <w:p/>
+    <w:p>
+      <w:pPr>
+        <w:numPr>
+          <w:ilvl w:val="0"/>
+          <w:numId w:val="1"/>
+        </w:numPr>
+      </w:pPr>
+      <w:r>
+        <w:t>An insurance company wants to predict whether a customer is likely to file a claim in the next year based on their driving history and demographics.</w:t>
+      </w:r>
+      <w:r>
+        <w:br/>
+        <w:t xml:space="preserve"> </w:t>
+      </w:r>
+      <w:r>
+        <w:rPr>
+          <w:b/>
+        </w:rPr>
+        <w:t>Q:</w:t>
+      </w:r>
+      <w:r>
+        <w:t xml:space="preserve"> Identify the problem type and outline the step-by-step logic to solve it.</w:t>
+      </w:r>
+      <w:r>
+        <w:br/>
+      </w:r>
+      <w:r>
+        <w:rPr>
+          <w:b/>
+          <w:bCs/>
+          <w:color w:val="1F497D" w:themeColor="text2"/>
+        </w:rPr>
+        <w:t>Answer:</w:t>
+      </w:r>
+    </w:p>
+    <w:p>
+      <w:pPr>
+        <w:pStyle w:val="ListParagraph"/>
+        <w:rPr>
+          <w:color w:val="1F497D" w:themeColor="text2"/>
+        </w:rPr>
+      </w:pPr>
+      <w:r>
+        <w:rPr>
+          <w:color w:val="1F497D" w:themeColor="text2"/>
+        </w:rPr>
+        <w:t xml:space="preserve">Problem Type: </w:t>
+      </w:r>
+    </w:p>
+    <w:p>
+      <w:pPr>
+        <w:ind w:left="720"/>
+        <w:rPr>
+          <w:color w:val="1F497D" w:themeColor="text2"/>
+        </w:rPr>
+      </w:pPr>
+      <w:r>
+        <w:rPr>
+          <w:color w:val="1F497D" w:themeColor="text2"/>
+        </w:rPr>
+        <w:t xml:space="preserve">step 1: Machine Learning </w:t>
+      </w:r>
+    </w:p>
+    <w:p>
+      <w:pPr>
+        <w:ind w:left="720"/>
+        <w:rPr>
+          <w:color w:val="1F497D" w:themeColor="text2"/>
+        </w:rPr>
+      </w:pPr>
+      <w:r>
+        <w:rPr>
+          <w:color w:val="1F497D" w:themeColor="text2"/>
+        </w:rPr>
+        <w:t xml:space="preserve">step 2: supervised Learning </w:t>
+      </w:r>
+    </w:p>
+    <w:p>
+      <w:pPr>
+        <w:ind w:left="720"/>
+        <w:rPr>
+          <w:color w:val="1F497D" w:themeColor="text2"/>
+        </w:rPr>
+      </w:pPr>
+      <w:r>
+        <w:rPr>
+          <w:color w:val="1F497D" w:themeColor="text2"/>
+        </w:rPr>
+        <w:t xml:space="preserve">step 3: Classification </w:t>
+      </w:r>
+      <w:r>
+        <w:rPr>
+          <w:color w:val="1F497D" w:themeColor="text2"/>
+        </w:rPr>
+        <w:t xml:space="preserve">problem </w:t>
+      </w:r>
+    </w:p>
+    <w:p>
+      <w:pPr>
+        <w:pStyle w:val="ListParagraph"/>
+        <w:rPr>
+          <w:color w:val="1F497D" w:themeColor="text2"/>
+        </w:rPr>
+      </w:pPr>
+    </w:p>
+    <w:p>
+      <w:pPr>
+        <w:pStyle w:val="ListParagraph"/>
+        <w:rPr>
+          <w:color w:val="1F497D" w:themeColor="text2"/>
+        </w:rPr>
+      </w:pPr>
+      <w:r>
+        <w:rPr>
+          <w:color w:val="1F497D" w:themeColor="text2"/>
+        </w:rPr>
+        <w:t xml:space="preserve">Classification </w:t>
+      </w:r>
+      <w:r>
+        <w:rPr>
+          <w:color w:val="1F497D" w:themeColor="text2"/>
+        </w:rPr>
+        <w:t xml:space="preserve">Problem </w:t>
+      </w:r>
+    </w:p>
+    <w:p>
+      <w:pPr>
+        <w:pStyle w:val="ListParagraph"/>
+        <w:rPr>
+          <w:color w:val="1F497D" w:themeColor="text2"/>
+        </w:rPr>
+      </w:pPr>
+      <w:r>
+        <w:rPr>
+          <w:color w:val="1F497D" w:themeColor="text2"/>
+        </w:rPr>
+        <w:t>Step by Step logic:</w:t>
+      </w:r>
+    </w:p>
+    <w:p>
+      <w:pPr>
+        <w:pStyle w:val="ListParagraph"/>
+        <w:numPr>
+          <w:ilvl w:val="0"/>
+          <w:numId w:val="5"/>
+        </w:numPr>
+        <w:rPr>
+          <w:color w:val="1F497D" w:themeColor="text2"/>
+        </w:rPr>
+      </w:pPr>
+      <w:r>
+        <w:rPr>
+          <w:color w:val="1F497D" w:themeColor="text2"/>
+        </w:rPr>
+        <w:t xml:space="preserve">Load the </w:t>
+      </w:r>
+      <w:proofErr w:type="spellStart"/>
+      <w:r>
+        <w:rPr>
+          <w:color w:val="1F497D" w:themeColor="text2"/>
+        </w:rPr>
+        <w:t>customer_insurance</w:t>
+      </w:r>
+      <w:proofErr w:type="spellEnd"/>
+      <w:r>
+        <w:rPr>
+          <w:color w:val="1F497D" w:themeColor="text2"/>
+        </w:rPr>
+        <w:t xml:space="preserve"> dataset</w:t>
+      </w:r>
+    </w:p>
+    <w:p>
+      <w:pPr>
+        <w:pStyle w:val="ListParagraph"/>
+        <w:numPr>
+          <w:ilvl w:val="0"/>
+          <w:numId w:val="5"/>
+        </w:numPr>
+        <w:rPr>
+          <w:color w:val="1F497D" w:themeColor="text2"/>
+        </w:rPr>
+      </w:pPr>
+      <w:r>
+        <w:rPr>
+          <w:color w:val="1F497D" w:themeColor="text2"/>
+        </w:rPr>
+        <w:t>Split input (</w:t>
+      </w:r>
+      <w:proofErr w:type="spellStart"/>
+      <w:r>
+        <w:rPr>
+          <w:color w:val="1F497D" w:themeColor="text2"/>
+        </w:rPr>
+        <w:t>driving_history</w:t>
+      </w:r>
+      <w:proofErr w:type="spellEnd"/>
+      <w:r>
+        <w:rPr>
+          <w:color w:val="1F497D" w:themeColor="text2"/>
+        </w:rPr>
+        <w:t>, demographics) and output (insurance claim - yes/no)</w:t>
+      </w:r>
+    </w:p>
+    <w:p>
+      <w:pPr>
+        <w:pStyle w:val="ListParagraph"/>
+        <w:numPr>
+          <w:ilvl w:val="0"/>
+          <w:numId w:val="5"/>
+        </w:numPr>
+        <w:rPr>
+          <w:color w:val="1F497D" w:themeColor="text2"/>
+        </w:rPr>
+      </w:pPr>
+      <w:r>
+        <w:rPr>
+          <w:color w:val="1F497D" w:themeColor="text2"/>
+        </w:rPr>
+        <w:t>Split train and test dataset</w:t>
+      </w:r>
+    </w:p>
+    <w:p>
+      <w:pPr>
+        <w:pStyle w:val="ListParagraph"/>
+        <w:numPr>
+          <w:ilvl w:val="0"/>
+          <w:numId w:val="5"/>
+        </w:numPr>
+        <w:rPr>
+          <w:color w:val="1F497D" w:themeColor="text2"/>
+        </w:rPr>
+      </w:pPr>
+      <w:r>
+        <w:rPr>
+          <w:color w:val="1F497D" w:themeColor="text2"/>
+        </w:rPr>
+        <w:t>Model creation using classification algorithms.</w:t>
+      </w:r>
+    </w:p>
+    <w:p>
+      <w:pPr>
+        <w:rPr>
+          <w:color w:val="1F497D" w:themeColor="text2"/>
+        </w:rPr>
+      </w:pPr>
+      <w:r>
+        <w:rPr>
+          <w:color w:val="1F497D" w:themeColor="text2"/>
+        </w:rPr>
+        <w:t>Must try algorithm: Binary classification (SVM, logistics regression, etc.)</w:t>
+      </w:r>
+    </w:p>
+    <w:p>
+      <w:pPr>
+        <w:pStyle w:val="ListParagraph"/>
+        <w:numPr>
+          <w:ilvl w:val="0"/>
+          <w:numId w:val="6"/>
+        </w:numPr>
+        <w:rPr>
+          <w:color w:val="1F497D" w:themeColor="text2"/>
+        </w:rPr>
+      </w:pPr>
+      <w:r>
+        <w:rPr>
+          <w:color w:val="1F497D" w:themeColor="text2"/>
+        </w:rPr>
+        <w:t xml:space="preserve">Test the model </w:t>
+      </w:r>
+    </w:p>
+    <w:p>
+      <w:pPr>
+        <w:pStyle w:val="ListParagraph"/>
+        <w:numPr>
+          <w:ilvl w:val="0"/>
+          <w:numId w:val="5"/>
+        </w:numPr>
+        <w:rPr>
+          <w:color w:val="1F497D" w:themeColor="text2"/>
+        </w:rPr>
+      </w:pPr>
+      <w:r>
+        <w:rPr>
+          <w:color w:val="1F497D" w:themeColor="text2"/>
+        </w:rPr>
+        <w:t xml:space="preserve">Model evaluation using confusion matrix &amp; classification report </w:t>
+      </w:r>
+    </w:p>
+    <w:p>
+      <w:pPr>
+        <w:pStyle w:val="ListParagraph"/>
+        <w:numPr>
+          <w:ilvl w:val="0"/>
+          <w:numId w:val="5"/>
+        </w:numPr>
+        <w:rPr>
+          <w:color w:val="1F497D" w:themeColor="text2"/>
+        </w:rPr>
+      </w:pPr>
+      <w:r>
+        <w:rPr>
+          <w:color w:val="1F497D" w:themeColor="text2"/>
+        </w:rPr>
+        <w:t>Finalize the best model for the customer insurance claim prediction based on the performance analyses from confusion matrix &amp; classification report of all algorithms</w:t>
+      </w:r>
+    </w:p>
+    <w:p>
+      <w:pPr>
+        <w:rPr>
+          <w:b/>
+          <w:bCs/>
+          <w:color w:val="1F497D" w:themeColor="text2"/>
+        </w:rPr>
+      </w:pPr>
+    </w:p>
+    <w:p/>
+    <w:p>
+      <w:pPr>
+        <w:numPr>
+          <w:ilvl w:val="0"/>
+          <w:numId w:val="1"/>
+        </w:numPr>
+      </w:pPr>
+      <w:r>
+        <w:lastRenderedPageBreak/>
+        <w:t>A streaming platform wants to recommend movies to users by grouping them based on their viewing preferences and watch history.</w:t>
+      </w:r>
+      <w:r>
+        <w:br/>
+        <w:t xml:space="preserve"> </w:t>
+      </w:r>
+      <w:r>
+        <w:rPr>
+          <w:b/>
+        </w:rPr>
+        <w:t>Q:</w:t>
+      </w:r>
+      <w:r>
+        <w:t xml:space="preserve"> Identify the problem type and outline the step-by-step logic to solve it.</w:t>
+      </w:r>
+    </w:p>
+    <w:p>
+      <w:pPr>
+        <w:ind w:left="720"/>
+        <w:rPr>
+          <w:b/>
+          <w:bCs/>
+          <w:color w:val="1F497D" w:themeColor="text2"/>
+        </w:rPr>
+      </w:pPr>
+      <w:r>
+        <w:rPr>
+          <w:b/>
+          <w:bCs/>
+          <w:color w:val="1F497D" w:themeColor="text2"/>
+        </w:rPr>
+        <w:t>Answer:</w:t>
+      </w:r>
+    </w:p>
+    <w:p>
+      <w:pPr>
+        <w:ind w:left="720"/>
+        <w:rPr>
+          <w:color w:val="1F497D" w:themeColor="text2"/>
+        </w:rPr>
+      </w:pPr>
+      <w:r>
+        <w:rPr>
+          <w:color w:val="1F497D" w:themeColor="text2"/>
+        </w:rPr>
+        <w:t xml:space="preserve">Problem Type: </w:t>
+      </w:r>
+    </w:p>
+    <w:p>
+      <w:pPr>
+        <w:ind w:left="720"/>
+        <w:rPr>
+          <w:color w:val="1F497D" w:themeColor="text2"/>
+        </w:rPr>
+      </w:pPr>
+      <w:r>
+        <w:rPr>
+          <w:color w:val="1F497D" w:themeColor="text2"/>
+        </w:rPr>
+        <w:t xml:space="preserve">step 1: </w:t>
+      </w:r>
+      <w:r>
+        <w:rPr>
+          <w:color w:val="1F497D" w:themeColor="text2"/>
+        </w:rPr>
+        <w:t>NLP</w:t>
+      </w:r>
+      <w:r>
+        <w:rPr>
+          <w:color w:val="1F497D" w:themeColor="text2"/>
+        </w:rPr>
+        <w:t>/ML</w:t>
+      </w:r>
+    </w:p>
+    <w:p>
+      <w:pPr>
+        <w:ind w:left="720"/>
+        <w:rPr>
+          <w:color w:val="1F497D" w:themeColor="text2"/>
+        </w:rPr>
+      </w:pPr>
+      <w:r>
+        <w:rPr>
+          <w:color w:val="1F497D" w:themeColor="text2"/>
+        </w:rPr>
+        <w:t xml:space="preserve">step 2: supervised Learning </w:t>
+      </w:r>
+    </w:p>
+    <w:p>
+      <w:pPr>
+        <w:ind w:left="720"/>
+        <w:rPr>
+          <w:color w:val="1F497D" w:themeColor="text2"/>
+        </w:rPr>
+      </w:pPr>
+      <w:r>
+        <w:rPr>
+          <w:color w:val="1F497D" w:themeColor="text2"/>
+        </w:rPr>
+        <w:t xml:space="preserve">step 3: Classification </w:t>
+      </w:r>
+      <w:r>
+        <w:rPr>
+          <w:color w:val="1F497D" w:themeColor="text2"/>
+        </w:rPr>
+        <w:t xml:space="preserve">problem </w:t>
+      </w:r>
+    </w:p>
+    <w:p>
+      <w:pPr>
+        <w:ind w:left="720"/>
+        <w:rPr>
+          <w:color w:val="1F497D" w:themeColor="text2"/>
+        </w:rPr>
+      </w:pPr>
+    </w:p>
+    <w:p>
+      <w:pPr>
+        <w:ind w:left="720"/>
+        <w:rPr>
+          <w:color w:val="1F497D" w:themeColor="text2"/>
+        </w:rPr>
+      </w:pPr>
       <w:r>
         <w:rPr>
           <w:color w:val="1F497D" w:themeColor="text2"/>
@@ -1201,7 +3475,6 @@
         <w:rPr>
           <w:color w:val="1F497D" w:themeColor="text2"/>
         </w:rPr>
-        <w:lastRenderedPageBreak/>
         <w:t>Step by Step logic:</w:t>
       </w:r>
     </w:p>
@@ -1222,17 +3495,19 @@
         </w:rPr>
         <w:t xml:space="preserve">Load the </w:t>
       </w:r>
-      <w:r>
-        <w:rPr>
-          <w:color w:val="1F497D" w:themeColor="text2"/>
-        </w:rPr>
-        <w:t>supermarket_c</w:t>
-      </w:r>
-      <w:r>
-        <w:rPr>
-          <w:color w:val="1F497D" w:themeColor="text2"/>
-        </w:rPr>
-        <w:t>ustomer dataset</w:t>
+      <w:proofErr w:type="spellStart"/>
+      <w:r>
+        <w:rPr>
+          <w:color w:val="1F497D" w:themeColor="text2"/>
+        </w:rPr>
+        <w:t>movie_recommendation</w:t>
+      </w:r>
+      <w:proofErr w:type="spellEnd"/>
+      <w:r>
+        <w:rPr>
+          <w:color w:val="1F497D" w:themeColor="text2"/>
+        </w:rPr>
+        <w:t xml:space="preserve"> dataset</w:t>
       </w:r>
     </w:p>
     <w:p>
@@ -1250,31 +3525,7 @@
         <w:rPr>
           <w:color w:val="1F497D" w:themeColor="text2"/>
         </w:rPr>
-        <w:t>Select the important features for X input data - (</w:t>
-      </w:r>
-      <w:r>
-        <w:rPr>
-          <w:color w:val="1F497D" w:themeColor="text2"/>
-        </w:rPr>
-        <w:t xml:space="preserve">shopping patterns:- </w:t>
-      </w:r>
-      <w:r>
-        <w:rPr>
-          <w:color w:val="1F497D" w:themeColor="text2"/>
-        </w:rPr>
-        <w:t>spending behavior</w:t>
-      </w:r>
-      <w:r>
-        <w:rPr>
-          <w:color w:val="1F497D" w:themeColor="text2"/>
-        </w:rPr>
-        <w:t>, income, savings, age</w:t>
-      </w:r>
-      <w:r>
-        <w:rPr>
-          <w:color w:val="1F497D" w:themeColor="text2"/>
-        </w:rPr>
-        <w:t>)</w:t>
+        <w:t>Select the important features for X input data - (viewing preferences, watch history)</w:t>
       </w:r>
     </w:p>
     <w:p>
@@ -1310,7 +3561,35 @@
         <w:rPr>
           <w:color w:val="1F497D" w:themeColor="text2"/>
         </w:rPr>
-        <w:t xml:space="preserve">Model creation &amp; prediction of Y_labels [cluster group] – (using clustering algorithms: K means, agglomerative, DBSCAN, optics, birch etc.) </w:t>
+        <w:t xml:space="preserve">Model creation &amp; prediction of </w:t>
+      </w:r>
+      <w:proofErr w:type="spellStart"/>
+      <w:r>
+        <w:rPr>
+          <w:color w:val="1F497D" w:themeColor="text2"/>
+        </w:rPr>
+        <w:t>Y_labels</w:t>
+      </w:r>
+      <w:proofErr w:type="spellEnd"/>
+      <w:r>
+        <w:rPr>
+          <w:color w:val="1F497D" w:themeColor="text2"/>
+        </w:rPr>
+        <w:t xml:space="preserve"> [cluster group] – (using clustering algorithms: K means, agglomerative, DBSCAN, optics, birch etc.) </w:t>
+      </w:r>
+    </w:p>
+    <w:p>
+      <w:pPr>
+        <w:ind w:left="1080"/>
+        <w:rPr>
+          <w:color w:val="1F497D" w:themeColor="text2"/>
+        </w:rPr>
+      </w:pPr>
+      <w:r>
+        <w:rPr>
+          <w:color w:val="1F497D" w:themeColor="text2"/>
+        </w:rPr>
+        <w:t>Must try algorithm: Naïve bayes – multinomial (good for detecting the positive &amp; negative customer sentiment as it works by computing the text occurrence count)</w:t>
       </w:r>
     </w:p>
     <w:p>
@@ -1346,7 +3625,21 @@
         <w:rPr>
           <w:color w:val="1F497D" w:themeColor="text2"/>
         </w:rPr>
-        <w:t>Visualize the clusters using seaborn.lmplot – (for visual inspection of clusters)</w:t>
+        <w:t xml:space="preserve">Visualize the clusters using </w:t>
+      </w:r>
+      <w:proofErr w:type="spellStart"/>
+      <w:r>
+        <w:rPr>
+          <w:color w:val="1F497D" w:themeColor="text2"/>
+        </w:rPr>
+        <w:t>seaborn.lmplot</w:t>
+      </w:r>
+      <w:proofErr w:type="spellEnd"/>
+      <w:r>
+        <w:rPr>
+          <w:color w:val="1F497D" w:themeColor="text2"/>
+        </w:rPr>
+        <w:t xml:space="preserve"> – (for visual inspection of clusters)</w:t>
       </w:r>
     </w:p>
     <w:p>
@@ -1382,19 +3675,7 @@
         <w:rPr>
           <w:color w:val="1F497D" w:themeColor="text2"/>
         </w:rPr>
-        <w:t xml:space="preserve">Finalize the best cluster model for the problem statement – (by analyzing the cluster outputs, evaluation metric, </w:t>
-      </w:r>
-      <w:r>
-        <w:rPr>
-          <w:color w:val="1F497D" w:themeColor="text2"/>
-        </w:rPr>
-        <w:t xml:space="preserve">domain knowledge </w:t>
-      </w:r>
-      <w:r>
-        <w:rPr>
-          <w:color w:val="1F497D" w:themeColor="text2"/>
-        </w:rPr>
-        <w:t>and visual cluster plot)</w:t>
+        <w:t>Finalize the best cluster model for the problem statement – (by analyzing the cluster outputs, evaluation metric, domain knowledge and visual cluster plot)</w:t>
       </w:r>
     </w:p>
     <w:p>
@@ -1402,16 +3683,7 @@
         <w:ind w:left="720"/>
       </w:pPr>
     </w:p>
-    <w:p>
-      <w:pPr>
-        <w:pStyle w:val="ListParagraph"/>
-      </w:pPr>
-    </w:p>
-    <w:p>
-      <w:pPr>
-        <w:ind w:left="720"/>
-      </w:pPr>
-    </w:p>
+    <w:p/>
     <w:p>
       <w:pPr>
         <w:numPr>
@@ -1420,7 +3692,7 @@
         </w:numPr>
       </w:pPr>
       <w:r>
-        <w:t>A company wants to estimate an employee’s salary based on their years of experience, job title, and education level.</w:t>
+        <w:t>A hospital wants to predict the recovery time of patients after surgery based on their age, medical history, and lifestyle habits.</w:t>
       </w:r>
       <w:r>
         <w:br/>
@@ -1460,6 +3732,76 @@
         </w:rPr>
         <w:t xml:space="preserve">Problem Type: </w:t>
       </w:r>
+    </w:p>
+    <w:p>
+      <w:pPr>
+        <w:ind w:left="720"/>
+        <w:rPr>
+          <w:color w:val="1F497D" w:themeColor="text2"/>
+        </w:rPr>
+      </w:pPr>
+      <w:r>
+        <w:rPr>
+          <w:color w:val="1F497D" w:themeColor="text2"/>
+        </w:rPr>
+        <w:t xml:space="preserve">step 1: Machine Learning </w:t>
+      </w:r>
+    </w:p>
+    <w:p>
+      <w:pPr>
+        <w:ind w:left="720"/>
+        <w:rPr>
+          <w:color w:val="1F497D" w:themeColor="text2"/>
+        </w:rPr>
+      </w:pPr>
+      <w:r>
+        <w:rPr>
+          <w:color w:val="1F497D" w:themeColor="text2"/>
+        </w:rPr>
+        <w:t xml:space="preserve">step 2: supervised Learning </w:t>
+      </w:r>
+    </w:p>
+    <w:p>
+      <w:pPr>
+        <w:ind w:left="720"/>
+        <w:rPr>
+          <w:color w:val="1F497D" w:themeColor="text2"/>
+        </w:rPr>
+      </w:pPr>
+      <w:r>
+        <w:rPr>
+          <w:color w:val="1F497D" w:themeColor="text2"/>
+        </w:rPr>
+        <w:t xml:space="preserve">step 3: </w:t>
+      </w:r>
+      <w:r>
+        <w:rPr>
+          <w:color w:val="1F497D" w:themeColor="text2"/>
+        </w:rPr>
+        <w:t xml:space="preserve">Regression </w:t>
+      </w:r>
+      <w:r>
+        <w:rPr>
+          <w:color w:val="1F497D" w:themeColor="text2"/>
+        </w:rPr>
+        <w:t xml:space="preserve">problem </w:t>
+      </w:r>
+    </w:p>
+    <w:p>
+      <w:pPr>
+        <w:pStyle w:val="ListParagraph"/>
+        <w:rPr>
+          <w:color w:val="1F497D" w:themeColor="text2"/>
+        </w:rPr>
+      </w:pPr>
+    </w:p>
+    <w:p>
+      <w:pPr>
+        <w:pStyle w:val="ListParagraph"/>
+        <w:rPr>
+          <w:color w:val="1F497D" w:themeColor="text2"/>
+        </w:rPr>
+      </w:pPr>
       <w:r>
         <w:rPr>
           <w:color w:val="1F497D" w:themeColor="text2"/>
@@ -1504,12 +3846,14 @@
         </w:rPr>
         <w:t xml:space="preserve">Load the </w:t>
       </w:r>
-      <w:r>
-        <w:rPr>
-          <w:color w:val="1F497D" w:themeColor="text2"/>
-        </w:rPr>
-        <w:t>company_emplyees</w:t>
-      </w:r>
+      <w:proofErr w:type="spellStart"/>
+      <w:r>
+        <w:rPr>
+          <w:color w:val="1F497D" w:themeColor="text2"/>
+        </w:rPr>
+        <w:t>surgery_patients</w:t>
+      </w:r>
+      <w:proofErr w:type="spellEnd"/>
       <w:r>
         <w:rPr>
           <w:color w:val="1F497D" w:themeColor="text2"/>
@@ -1529,20 +3873,28 @@
         <w:rPr>
           <w:color w:val="1F497D" w:themeColor="text2"/>
         </w:rPr>
-        <w:t>Convert the categorical data (</w:t>
-      </w:r>
-      <w:r>
-        <w:rPr>
-          <w:color w:val="1F497D" w:themeColor="text2"/>
-        </w:rPr>
-        <w:t>job_title, educational_level</w:t>
-      </w:r>
-      <w:r>
-        <w:rPr>
-          <w:color w:val="1F497D" w:themeColor="text2"/>
-        </w:rPr>
-        <w:t xml:space="preserve"> column) into numerical data using pd.get_dummies</w:t>
-      </w:r>
+        <w:t xml:space="preserve">Convert the categorical data </w:t>
+      </w:r>
+      <w:r>
+        <w:rPr>
+          <w:color w:val="1F497D" w:themeColor="text2"/>
+        </w:rPr>
+        <w:t>(life style habits-physical activity</w:t>
+      </w:r>
+      <w:r>
+        <w:rPr>
+          <w:color w:val="1F497D" w:themeColor="text2"/>
+        </w:rPr>
+        <w:t xml:space="preserve"> column) into numerical data using </w:t>
+      </w:r>
+      <w:proofErr w:type="spellStart"/>
+      <w:r>
+        <w:rPr>
+          <w:color w:val="1F497D" w:themeColor="text2"/>
+        </w:rPr>
+        <w:t>pd.get_dummies</w:t>
+      </w:r>
+      <w:proofErr w:type="spellEnd"/>
     </w:p>
     <w:p>
       <w:pPr>
@@ -1562,7 +3914,45 @@
         <w:rPr>
           <w:color w:val="1F497D" w:themeColor="text2"/>
         </w:rPr>
-        <w:t xml:space="preserve"> (years_of_experience, job_title, education_level)</w:t>
+        <w:t xml:space="preserve"> (</w:t>
+      </w:r>
+      <w:r>
+        <w:rPr>
+          <w:color w:val="1F497D" w:themeColor="text2"/>
+        </w:rPr>
+        <w:t xml:space="preserve">age ;  </w:t>
+      </w:r>
+      <w:proofErr w:type="spellStart"/>
+      <w:r>
+        <w:rPr>
+          <w:color w:val="1F497D" w:themeColor="text2"/>
+        </w:rPr>
+        <w:t>medical_history</w:t>
+      </w:r>
+      <w:proofErr w:type="spellEnd"/>
+      <w:r>
+        <w:rPr>
+          <w:color w:val="1F497D" w:themeColor="text2"/>
+        </w:rPr>
+        <w:t xml:space="preserve"> – diabetes, BMI, hyper tension; life style habits-physical activity</w:t>
+      </w:r>
+      <w:r>
+        <w:rPr>
+          <w:color w:val="1F497D" w:themeColor="text2"/>
+        </w:rPr>
+        <w:t xml:space="preserve"> column</w:t>
+      </w:r>
+      <w:r>
+        <w:rPr>
+          <w:color w:val="1F497D" w:themeColor="text2"/>
+        </w:rPr>
+        <w:t>s</w:t>
+      </w:r>
+      <w:r>
+        <w:rPr>
+          <w:color w:val="1F497D" w:themeColor="text2"/>
+        </w:rPr>
+        <w:t>)</w:t>
       </w:r>
       <w:r>
         <w:rPr>
@@ -1574,7 +3964,21 @@
         <w:rPr>
           <w:color w:val="1F497D" w:themeColor="text2"/>
         </w:rPr>
-        <w:t xml:space="preserve"> (employee_salary)</w:t>
+        <w:t xml:space="preserve"> (</w:t>
+      </w:r>
+      <w:proofErr w:type="spellStart"/>
+      <w:r>
+        <w:rPr>
+          <w:color w:val="1F497D" w:themeColor="text2"/>
+        </w:rPr>
+        <w:t>patients_recovery_time</w:t>
+      </w:r>
+      <w:proofErr w:type="spellEnd"/>
+      <w:r>
+        <w:rPr>
+          <w:color w:val="1F497D" w:themeColor="text2"/>
+        </w:rPr>
+        <w:t>)</w:t>
       </w:r>
     </w:p>
     <w:p>
@@ -1604,7 +4008,22 @@
         <w:rPr>
           <w:color w:val="1F497D" w:themeColor="text2"/>
         </w:rPr>
-        <w:t>Model creation using regression algorithms (linear regression, SVR, decision tree, random forest, boosting etc…)</w:t>
+        <w:lastRenderedPageBreak/>
+        <w:t xml:space="preserve">Model creation using regression algorithms (linear regression, SVR, decision tree, random forest, boosting </w:t>
+      </w:r>
+      <w:proofErr w:type="spellStart"/>
+      <w:r>
+        <w:rPr>
+          <w:color w:val="1F497D" w:themeColor="text2"/>
+        </w:rPr>
+        <w:t>etc</w:t>
+      </w:r>
+      <w:proofErr w:type="spellEnd"/>
+      <w:r>
+        <w:rPr>
+          <w:color w:val="1F497D" w:themeColor="text2"/>
+        </w:rPr>
+        <w:t>…)</w:t>
       </w:r>
     </w:p>
     <w:p>
@@ -1665,7 +4084,7 @@
         </w:numPr>
       </w:pPr>
       <w:r>
-        <w:t>An email provider wants to automatically classify incoming emails as spam or not spam based on their content and sender details.</w:t>
+        <w:t>A university wants to predict a student’s final exam score based on study hours, attendance, and past academic performance.</w:t>
       </w:r>
       <w:r>
         <w:br/>
@@ -1680,289 +4099,16 @@
       <w:r>
         <w:t xml:space="preserve"> Identify the problem type and outline the step-by-step logic to solve it.</w:t>
       </w:r>
-      <w:r>
-        <w:br/>
-      </w:r>
-      <w:r>
+    </w:p>
+    <w:p>
+      <w:pPr>
+        <w:ind w:firstLine="360"/>
         <w:rPr>
           <w:b/>
           <w:bCs/>
           <w:color w:val="1F497D" w:themeColor="text2"/>
         </w:rPr>
-        <w:t>Answer:</w:t>
-      </w:r>
-    </w:p>
-    <w:p>
-      <w:pPr>
-        <w:pStyle w:val="ListParagraph"/>
-        <w:rPr>
-          <w:color w:val="1F497D" w:themeColor="text2"/>
-        </w:rPr>
-      </w:pPr>
-      <w:r>
-        <w:rPr>
-          <w:color w:val="1F497D" w:themeColor="text2"/>
-        </w:rPr>
-        <w:t xml:space="preserve">Problem Type: </w:t>
-      </w:r>
-      <w:r>
-        <w:rPr>
-          <w:color w:val="1F497D" w:themeColor="text2"/>
-        </w:rPr>
-        <w:t xml:space="preserve">Classification </w:t>
-      </w:r>
-      <w:r>
-        <w:rPr>
-          <w:color w:val="1F497D" w:themeColor="text2"/>
-        </w:rPr>
-        <w:t xml:space="preserve">Problem </w:t>
-      </w:r>
-    </w:p>
-    <w:p>
-      <w:pPr>
-        <w:pStyle w:val="ListParagraph"/>
-        <w:rPr>
-          <w:color w:val="1F497D" w:themeColor="text2"/>
-        </w:rPr>
-      </w:pPr>
-      <w:r>
-        <w:rPr>
-          <w:color w:val="1F497D" w:themeColor="text2"/>
-        </w:rPr>
-        <w:t>Step by Step logic:</w:t>
-      </w:r>
-    </w:p>
-    <w:p>
-      <w:pPr>
-        <w:pStyle w:val="ListParagraph"/>
-        <w:numPr>
-          <w:ilvl w:val="0"/>
-          <w:numId w:val="4"/>
-        </w:numPr>
-        <w:rPr>
-          <w:color w:val="1F497D" w:themeColor="text2"/>
-        </w:rPr>
-      </w:pPr>
-      <w:r>
-        <w:rPr>
-          <w:color w:val="1F497D" w:themeColor="text2"/>
-        </w:rPr>
-        <w:t>Load the email_dataset</w:t>
-      </w:r>
-    </w:p>
-    <w:p>
-      <w:pPr>
-        <w:pStyle w:val="ListParagraph"/>
-        <w:numPr>
-          <w:ilvl w:val="0"/>
-          <w:numId w:val="4"/>
-        </w:numPr>
-        <w:rPr>
-          <w:color w:val="1F497D" w:themeColor="text2"/>
-        </w:rPr>
-      </w:pPr>
-      <w:r>
-        <w:rPr>
-          <w:color w:val="1F497D" w:themeColor="text2"/>
-        </w:rPr>
-        <w:t>Split input (message_content, sender_details) and output (email_classify)</w:t>
-      </w:r>
-    </w:p>
-    <w:p>
-      <w:pPr>
-        <w:pStyle w:val="ListParagraph"/>
-        <w:numPr>
-          <w:ilvl w:val="0"/>
-          <w:numId w:val="4"/>
-        </w:numPr>
-        <w:rPr>
-          <w:color w:val="1F497D" w:themeColor="text2"/>
-        </w:rPr>
-      </w:pPr>
-      <w:r>
-        <w:rPr>
-          <w:color w:val="1F497D" w:themeColor="text2"/>
-        </w:rPr>
-        <w:t>Split train &amp; test dataset</w:t>
-      </w:r>
-    </w:p>
-    <w:p>
-      <w:pPr>
-        <w:pStyle w:val="ListParagraph"/>
-        <w:numPr>
-          <w:ilvl w:val="0"/>
-          <w:numId w:val="4"/>
-        </w:numPr>
-        <w:rPr>
-          <w:color w:val="1F497D" w:themeColor="text2"/>
-        </w:rPr>
-      </w:pPr>
-      <w:r>
-        <w:rPr>
-          <w:color w:val="1F497D" w:themeColor="text2"/>
-        </w:rPr>
-        <w:t>Model creation using classification algorithms.</w:t>
-      </w:r>
-    </w:p>
-    <w:p>
-      <w:pPr>
-        <w:rPr>
-          <w:color w:val="1F497D" w:themeColor="text2"/>
-        </w:rPr>
-      </w:pPr>
-      <w:r>
-        <w:rPr>
-          <w:color w:val="1F497D" w:themeColor="text2"/>
-        </w:rPr>
-        <w:lastRenderedPageBreak/>
-        <w:t>Must try</w:t>
-      </w:r>
-      <w:r>
-        <w:rPr>
-          <w:color w:val="1F497D" w:themeColor="text2"/>
-        </w:rPr>
-        <w:t xml:space="preserve"> </w:t>
-      </w:r>
-      <w:r>
-        <w:rPr>
-          <w:color w:val="1F497D" w:themeColor="text2"/>
-        </w:rPr>
-        <w:t>algorithm</w:t>
-      </w:r>
-      <w:r>
-        <w:rPr>
-          <w:color w:val="1F497D" w:themeColor="text2"/>
-        </w:rPr>
-        <w:t xml:space="preserve">: </w:t>
-      </w:r>
-      <w:r>
-        <w:rPr>
-          <w:color w:val="1F497D" w:themeColor="text2"/>
-        </w:rPr>
-        <w:t>Naïve bayes – multinomial (good for detecting the spam or not spam emails as it works by computing the text occurrence count)</w:t>
-      </w:r>
-    </w:p>
-    <w:p>
-      <w:pPr>
-        <w:pStyle w:val="ListParagraph"/>
-        <w:ind w:left="1440"/>
-        <w:rPr>
-          <w:color w:val="1F497D" w:themeColor="text2"/>
-        </w:rPr>
-      </w:pPr>
-    </w:p>
-    <w:p>
-      <w:pPr>
-        <w:pStyle w:val="ListParagraph"/>
-        <w:numPr>
-          <w:ilvl w:val="0"/>
-          <w:numId w:val="4"/>
-        </w:numPr>
-        <w:rPr>
-          <w:color w:val="1F497D" w:themeColor="text2"/>
-        </w:rPr>
-      </w:pPr>
-      <w:r>
-        <w:rPr>
-          <w:color w:val="1F497D" w:themeColor="text2"/>
-        </w:rPr>
-        <w:t xml:space="preserve">Test the model </w:t>
-      </w:r>
-    </w:p>
-    <w:p>
-      <w:pPr>
-        <w:pStyle w:val="ListParagraph"/>
-        <w:numPr>
-          <w:ilvl w:val="0"/>
-          <w:numId w:val="4"/>
-        </w:numPr>
-        <w:rPr>
-          <w:color w:val="1F497D" w:themeColor="text2"/>
-        </w:rPr>
-      </w:pPr>
-      <w:r>
-        <w:rPr>
-          <w:color w:val="1F497D" w:themeColor="text2"/>
-        </w:rPr>
-        <w:t xml:space="preserve">Model evaluation using confusion matrix &amp; classification report </w:t>
-      </w:r>
-    </w:p>
-    <w:p>
-      <w:pPr>
-        <w:pStyle w:val="ListParagraph"/>
-        <w:numPr>
-          <w:ilvl w:val="0"/>
-          <w:numId w:val="4"/>
-        </w:numPr>
-        <w:rPr>
-          <w:color w:val="1F497D" w:themeColor="text2"/>
-        </w:rPr>
-      </w:pPr>
-      <w:r>
-        <w:rPr>
-          <w:color w:val="1F497D" w:themeColor="text2"/>
-        </w:rPr>
-        <w:t xml:space="preserve">Finalize the best model for the Email classification of spam or not based on the performance analyses from </w:t>
-      </w:r>
-      <w:r>
-        <w:rPr>
-          <w:color w:val="1F497D" w:themeColor="text2"/>
-        </w:rPr>
-        <w:t>confusion matrix &amp; classification report</w:t>
-      </w:r>
-      <w:r>
-        <w:rPr>
-          <w:color w:val="1F497D" w:themeColor="text2"/>
-        </w:rPr>
-        <w:t xml:space="preserve"> of all algorithms</w:t>
-      </w:r>
-    </w:p>
-    <w:p>
-      <w:pPr>
-        <w:rPr>
-          <w:color w:val="1F497D" w:themeColor="text2"/>
-        </w:rPr>
-      </w:pPr>
-    </w:p>
-    <w:p>
-      <w:pPr>
-        <w:rPr>
-          <w:color w:val="1F497D" w:themeColor="text2"/>
-        </w:rPr>
-      </w:pPr>
-    </w:p>
-    <w:p>
-      <w:pPr>
-        <w:ind w:left="720"/>
-      </w:pPr>
-    </w:p>
-    <w:p/>
-    <w:p>
-      <w:pPr>
-        <w:numPr>
-          <w:ilvl w:val="0"/>
-          <w:numId w:val="1"/>
-        </w:numPr>
-      </w:pPr>
-      <w:r>
-        <w:t>A business wants to analyze customer reviews of its products and determine whether the sentiment is positive or negative.</w:t>
-      </w:r>
-      <w:r>
-        <w:br/>
-        <w:t xml:space="preserve"> </w:t>
-      </w:r>
-      <w:r>
-        <w:rPr>
-          <w:b/>
-        </w:rPr>
-        <w:t>Q:</w:t>
-      </w:r>
-      <w:r>
-        <w:t xml:space="preserve"> Identify the problem type and outline the step-by-step logic to solve it.</w:t>
-      </w:r>
-      <w:r>
-        <w:br/>
-      </w:r>
+      </w:pPr>
       <w:r>
         <w:rPr>
           <w:b/>
@@ -1974,270 +4120,13 @@
     </w:p>
     <w:p>
       <w:pPr>
-        <w:pStyle w:val="ListParagraph"/>
-        <w:rPr>
-          <w:color w:val="1F497D" w:themeColor="text2"/>
-        </w:rPr>
-      </w:pPr>
-      <w:r>
-        <w:rPr>
-          <w:color w:val="1F497D" w:themeColor="text2"/>
-        </w:rPr>
-        <w:t xml:space="preserve">Problem Type: </w:t>
-      </w:r>
-      <w:r>
-        <w:rPr>
-          <w:color w:val="1F497D" w:themeColor="text2"/>
-        </w:rPr>
-        <w:t xml:space="preserve">Classification </w:t>
-      </w:r>
-      <w:r>
-        <w:rPr>
-          <w:color w:val="1F497D" w:themeColor="text2"/>
-        </w:rPr>
-        <w:t xml:space="preserve">Problem </w:t>
-      </w:r>
-    </w:p>
-    <w:p>
-      <w:pPr>
-        <w:pStyle w:val="ListParagraph"/>
-        <w:rPr>
-          <w:color w:val="1F497D" w:themeColor="text2"/>
-        </w:rPr>
-      </w:pPr>
-      <w:r>
-        <w:rPr>
-          <w:color w:val="1F497D" w:themeColor="text2"/>
-        </w:rPr>
-        <w:t>Step by Step logic:</w:t>
-      </w:r>
-    </w:p>
-    <w:p>
-      <w:pPr>
-        <w:pStyle w:val="ListParagraph"/>
-        <w:numPr>
-          <w:ilvl w:val="0"/>
-          <w:numId w:val="5"/>
-        </w:numPr>
-        <w:rPr>
-          <w:color w:val="1F497D" w:themeColor="text2"/>
-        </w:rPr>
-      </w:pPr>
-      <w:r>
-        <w:rPr>
-          <w:color w:val="1F497D" w:themeColor="text2"/>
-        </w:rPr>
-        <w:t>Load the customer_reviews dataset</w:t>
-      </w:r>
-    </w:p>
-    <w:p>
-      <w:pPr>
-        <w:pStyle w:val="ListParagraph"/>
-        <w:numPr>
-          <w:ilvl w:val="0"/>
-          <w:numId w:val="5"/>
-        </w:numPr>
-        <w:rPr>
-          <w:color w:val="1F497D" w:themeColor="text2"/>
-        </w:rPr>
-      </w:pPr>
-      <w:r>
-        <w:rPr>
-          <w:color w:val="1F497D" w:themeColor="text2"/>
-        </w:rPr>
-        <w:t>Split input (customer_reviews) and output (sentiment- positive/negative)</w:t>
-      </w:r>
-    </w:p>
-    <w:p>
-      <w:pPr>
-        <w:pStyle w:val="ListParagraph"/>
-        <w:numPr>
-          <w:ilvl w:val="0"/>
-          <w:numId w:val="5"/>
-        </w:numPr>
-        <w:rPr>
-          <w:color w:val="1F497D" w:themeColor="text2"/>
-        </w:rPr>
-      </w:pPr>
-      <w:r>
-        <w:rPr>
-          <w:color w:val="1F497D" w:themeColor="text2"/>
-        </w:rPr>
-        <w:t>Split train and test dataset</w:t>
-      </w:r>
-    </w:p>
-    <w:p>
-      <w:pPr>
-        <w:pStyle w:val="ListParagraph"/>
-        <w:numPr>
-          <w:ilvl w:val="0"/>
-          <w:numId w:val="5"/>
-        </w:numPr>
-        <w:rPr>
-          <w:color w:val="1F497D" w:themeColor="text2"/>
-        </w:rPr>
-      </w:pPr>
-      <w:r>
-        <w:rPr>
-          <w:color w:val="1F497D" w:themeColor="text2"/>
-        </w:rPr>
-        <w:t>Model creation using classification algorithms.</w:t>
-      </w:r>
-    </w:p>
-    <w:p>
-      <w:pPr>
-        <w:rPr>
-          <w:color w:val="1F497D" w:themeColor="text2"/>
-        </w:rPr>
-      </w:pPr>
-      <w:r>
-        <w:rPr>
-          <w:color w:val="1F497D" w:themeColor="text2"/>
-        </w:rPr>
-        <w:t>Must try</w:t>
-      </w:r>
-      <w:r>
-        <w:rPr>
-          <w:color w:val="1F497D" w:themeColor="text2"/>
-        </w:rPr>
-        <w:t xml:space="preserve"> algorithm</w:t>
-      </w:r>
-      <w:r>
-        <w:rPr>
-          <w:color w:val="1F497D" w:themeColor="text2"/>
-        </w:rPr>
-        <w:t xml:space="preserve">: Naïve bayes – multinomial (good for detecting the </w:t>
-      </w:r>
-      <w:r>
-        <w:rPr>
-          <w:color w:val="1F497D" w:themeColor="text2"/>
-        </w:rPr>
-        <w:t>positive &amp; negative</w:t>
-      </w:r>
-      <w:r>
-        <w:rPr>
-          <w:color w:val="1F497D" w:themeColor="text2"/>
-        </w:rPr>
-        <w:t xml:space="preserve"> customer sentiment </w:t>
-      </w:r>
-      <w:r>
-        <w:rPr>
-          <w:color w:val="1F497D" w:themeColor="text2"/>
-        </w:rPr>
-        <w:t>as it works by computing the text occurrence count)</w:t>
-      </w:r>
-    </w:p>
-    <w:p>
-      <w:pPr>
-        <w:pStyle w:val="ListParagraph"/>
-        <w:numPr>
-          <w:ilvl w:val="0"/>
-          <w:numId w:val="5"/>
-        </w:numPr>
-        <w:rPr>
-          <w:color w:val="1F497D" w:themeColor="text2"/>
-        </w:rPr>
-      </w:pPr>
-      <w:r>
-        <w:rPr>
-          <w:color w:val="1F497D" w:themeColor="text2"/>
-        </w:rPr>
-        <w:t xml:space="preserve">Test the model </w:t>
-      </w:r>
-    </w:p>
-    <w:p>
-      <w:pPr>
-        <w:pStyle w:val="ListParagraph"/>
-        <w:numPr>
-          <w:ilvl w:val="0"/>
-          <w:numId w:val="5"/>
-        </w:numPr>
-        <w:rPr>
-          <w:color w:val="1F497D" w:themeColor="text2"/>
-        </w:rPr>
-      </w:pPr>
-      <w:r>
-        <w:rPr>
-          <w:color w:val="1F497D" w:themeColor="text2"/>
-        </w:rPr>
-        <w:t xml:space="preserve">Model evaluation using confusion matrix &amp; classification report </w:t>
-      </w:r>
-    </w:p>
-    <w:p>
-      <w:pPr>
-        <w:pStyle w:val="ListParagraph"/>
-        <w:numPr>
-          <w:ilvl w:val="0"/>
-          <w:numId w:val="5"/>
-        </w:numPr>
-        <w:rPr>
-          <w:color w:val="1F497D" w:themeColor="text2"/>
-        </w:rPr>
-      </w:pPr>
-      <w:r>
-        <w:rPr>
-          <w:color w:val="1F497D" w:themeColor="text2"/>
-        </w:rPr>
-        <w:t xml:space="preserve">Finalize the best model for the </w:t>
-      </w:r>
-      <w:r>
-        <w:rPr>
-          <w:color w:val="1F497D" w:themeColor="text2"/>
-        </w:rPr>
-        <w:t xml:space="preserve">customer review sentiment analysis </w:t>
-      </w:r>
-      <w:r>
-        <w:rPr>
-          <w:color w:val="1F497D" w:themeColor="text2"/>
-        </w:rPr>
-        <w:t>on the performance analyses from confusion matrix &amp; classification report of all algorithms</w:t>
-      </w:r>
-    </w:p>
-    <w:p>
-      <w:pPr>
-        <w:ind w:left="720"/>
-      </w:pPr>
-    </w:p>
-    <w:p>
-      <w:pPr>
-        <w:pStyle w:val="ListParagraph"/>
-      </w:pPr>
-    </w:p>
-    <w:p/>
-    <w:p>
-      <w:pPr>
-        <w:numPr>
-          <w:ilvl w:val="0"/>
-          <w:numId w:val="1"/>
-        </w:numPr>
-      </w:pPr>
-      <w:r>
-        <w:t>An insurance company wants to predict whether a customer is likely to file a claim in the next year based on their driving history and demographics.</w:t>
-      </w:r>
-      <w:r>
-        <w:br/>
-        <w:t xml:space="preserve"> </w:t>
-      </w:r>
-      <w:r>
-        <w:rPr>
-          <w:b/>
-        </w:rPr>
-        <w:t>Q:</w:t>
-      </w:r>
-      <w:r>
-        <w:t xml:space="preserve"> Identify the problem type and outline the step-by-step logic to solve it.</w:t>
-      </w:r>
-      <w:r>
-        <w:br/>
-      </w:r>
-      <w:r>
+        <w:ind w:firstLine="360"/>
         <w:rPr>
           <w:b/>
           <w:bCs/>
           <w:color w:val="1F497D" w:themeColor="text2"/>
         </w:rPr>
-        <w:t>Answer:</w:t>
-      </w:r>
+      </w:pPr>
     </w:p>
     <w:p>
       <w:pPr>
@@ -2252,301 +4141,19 @@
         </w:rPr>
         <w:t xml:space="preserve">Problem Type: </w:t>
       </w:r>
-      <w:r>
-        <w:rPr>
-          <w:color w:val="1F497D" w:themeColor="text2"/>
-        </w:rPr>
-        <w:t xml:space="preserve">Classification </w:t>
-      </w:r>
-      <w:r>
-        <w:rPr>
-          <w:color w:val="1F497D" w:themeColor="text2"/>
-        </w:rPr>
-        <w:t xml:space="preserve">Problem </w:t>
-      </w:r>
-    </w:p>
-    <w:p>
-      <w:pPr>
-        <w:pStyle w:val="ListParagraph"/>
-        <w:rPr>
-          <w:color w:val="1F497D" w:themeColor="text2"/>
-        </w:rPr>
-      </w:pPr>
-      <w:r>
-        <w:rPr>
-          <w:color w:val="1F497D" w:themeColor="text2"/>
-        </w:rPr>
-        <w:t>Step by Step logic:</w:t>
-      </w:r>
-    </w:p>
-    <w:p>
-      <w:pPr>
-        <w:pStyle w:val="ListParagraph"/>
-        <w:numPr>
-          <w:ilvl w:val="0"/>
-          <w:numId w:val="5"/>
-        </w:numPr>
-        <w:rPr>
-          <w:color w:val="1F497D" w:themeColor="text2"/>
-        </w:rPr>
-      </w:pPr>
-      <w:r>
-        <w:rPr>
-          <w:color w:val="1F497D" w:themeColor="text2"/>
-        </w:rPr>
-        <w:t>Load the customer_</w:t>
-      </w:r>
-      <w:r>
-        <w:rPr>
-          <w:color w:val="1F497D" w:themeColor="text2"/>
-        </w:rPr>
-        <w:t>insurance</w:t>
-      </w:r>
-      <w:r>
-        <w:rPr>
-          <w:color w:val="1F497D" w:themeColor="text2"/>
-        </w:rPr>
-        <w:t xml:space="preserve"> dataset</w:t>
-      </w:r>
-    </w:p>
-    <w:p>
-      <w:pPr>
-        <w:pStyle w:val="ListParagraph"/>
-        <w:numPr>
-          <w:ilvl w:val="0"/>
-          <w:numId w:val="5"/>
-        </w:numPr>
-        <w:rPr>
-          <w:color w:val="1F497D" w:themeColor="text2"/>
-        </w:rPr>
-      </w:pPr>
-      <w:r>
-        <w:rPr>
-          <w:color w:val="1F497D" w:themeColor="text2"/>
-        </w:rPr>
-        <w:t>Split input (</w:t>
-      </w:r>
-      <w:r>
-        <w:rPr>
-          <w:color w:val="1F497D" w:themeColor="text2"/>
-        </w:rPr>
-        <w:t>driving_history, demographics</w:t>
-      </w:r>
-      <w:r>
-        <w:rPr>
-          <w:color w:val="1F497D" w:themeColor="text2"/>
-        </w:rPr>
-        <w:t>) and output (</w:t>
-      </w:r>
-      <w:r>
-        <w:rPr>
-          <w:color w:val="1F497D" w:themeColor="text2"/>
-        </w:rPr>
-        <w:t xml:space="preserve">insurance claim </w:t>
-      </w:r>
-      <w:r>
-        <w:rPr>
-          <w:color w:val="1F497D" w:themeColor="text2"/>
-        </w:rPr>
-        <w:t xml:space="preserve">- </w:t>
-      </w:r>
-      <w:r>
-        <w:rPr>
-          <w:color w:val="1F497D" w:themeColor="text2"/>
-        </w:rPr>
-        <w:t>yes</w:t>
-      </w:r>
-      <w:r>
-        <w:rPr>
-          <w:color w:val="1F497D" w:themeColor="text2"/>
-        </w:rPr>
-        <w:t>/</w:t>
-      </w:r>
-      <w:r>
-        <w:rPr>
-          <w:color w:val="1F497D" w:themeColor="text2"/>
-        </w:rPr>
-        <w:t>no</w:t>
-      </w:r>
-      <w:r>
-        <w:rPr>
-          <w:color w:val="1F497D" w:themeColor="text2"/>
-        </w:rPr>
-        <w:t>)</w:t>
-      </w:r>
-    </w:p>
-    <w:p>
-      <w:pPr>
-        <w:pStyle w:val="ListParagraph"/>
-        <w:numPr>
-          <w:ilvl w:val="0"/>
-          <w:numId w:val="5"/>
-        </w:numPr>
-        <w:rPr>
-          <w:color w:val="1F497D" w:themeColor="text2"/>
-        </w:rPr>
-      </w:pPr>
-      <w:r>
-        <w:rPr>
-          <w:color w:val="1F497D" w:themeColor="text2"/>
-        </w:rPr>
-        <w:t>Split train and test dataset</w:t>
-      </w:r>
-    </w:p>
-    <w:p>
-      <w:pPr>
-        <w:pStyle w:val="ListParagraph"/>
-        <w:numPr>
-          <w:ilvl w:val="0"/>
-          <w:numId w:val="5"/>
-        </w:numPr>
-        <w:rPr>
-          <w:color w:val="1F497D" w:themeColor="text2"/>
-        </w:rPr>
-      </w:pPr>
-      <w:r>
-        <w:rPr>
-          <w:color w:val="1F497D" w:themeColor="text2"/>
-        </w:rPr>
-        <w:t>Model creation using classification algorithms.</w:t>
-      </w:r>
-    </w:p>
-    <w:p>
-      <w:pPr>
-        <w:rPr>
-          <w:color w:val="1F497D" w:themeColor="text2"/>
-        </w:rPr>
-      </w:pPr>
-      <w:r>
-        <w:rPr>
-          <w:color w:val="1F497D" w:themeColor="text2"/>
-        </w:rPr>
-        <w:t xml:space="preserve">Must try algorithm: </w:t>
-      </w:r>
-      <w:r>
-        <w:rPr>
-          <w:color w:val="1F497D" w:themeColor="text2"/>
-        </w:rPr>
-        <w:t>Binary classification (SVM, logistics regression, etc.)</w:t>
-      </w:r>
-    </w:p>
-    <w:p>
-      <w:pPr>
-        <w:pStyle w:val="ListParagraph"/>
-        <w:numPr>
-          <w:ilvl w:val="0"/>
-          <w:numId w:val="6"/>
-        </w:numPr>
-        <w:rPr>
-          <w:color w:val="1F497D" w:themeColor="text2"/>
-        </w:rPr>
-      </w:pPr>
-      <w:r>
-        <w:rPr>
-          <w:color w:val="1F497D" w:themeColor="text2"/>
-        </w:rPr>
-        <w:lastRenderedPageBreak/>
-        <w:t xml:space="preserve">Test the model </w:t>
-      </w:r>
-    </w:p>
-    <w:p>
-      <w:pPr>
-        <w:pStyle w:val="ListParagraph"/>
-        <w:numPr>
-          <w:ilvl w:val="0"/>
-          <w:numId w:val="5"/>
-        </w:numPr>
-        <w:rPr>
-          <w:color w:val="1F497D" w:themeColor="text2"/>
-        </w:rPr>
-      </w:pPr>
-      <w:r>
-        <w:rPr>
-          <w:color w:val="1F497D" w:themeColor="text2"/>
-        </w:rPr>
-        <w:t xml:space="preserve">Model evaluation using confusion matrix &amp; classification report </w:t>
-      </w:r>
-    </w:p>
-    <w:p>
-      <w:pPr>
-        <w:pStyle w:val="ListParagraph"/>
-        <w:numPr>
-          <w:ilvl w:val="0"/>
-          <w:numId w:val="5"/>
-        </w:numPr>
-        <w:rPr>
-          <w:color w:val="1F497D" w:themeColor="text2"/>
-        </w:rPr>
-      </w:pPr>
-      <w:r>
-        <w:rPr>
-          <w:color w:val="1F497D" w:themeColor="text2"/>
-        </w:rPr>
-        <w:t xml:space="preserve">Finalize the best model for the </w:t>
-      </w:r>
-      <w:r>
-        <w:rPr>
-          <w:color w:val="1F497D" w:themeColor="text2"/>
-        </w:rPr>
-        <w:t xml:space="preserve">customer insurance claim prediction based </w:t>
-      </w:r>
-      <w:r>
-        <w:rPr>
-          <w:color w:val="1F497D" w:themeColor="text2"/>
-        </w:rPr>
-        <w:t>on the performance analyses from confusion matrix &amp; classification report of all algorithms</w:t>
-      </w:r>
-    </w:p>
-    <w:p>
-      <w:pPr>
-        <w:rPr>
-          <w:b/>
-          <w:bCs/>
-          <w:color w:val="1F497D" w:themeColor="text2"/>
-        </w:rPr>
-      </w:pPr>
-    </w:p>
-    <w:p/>
-    <w:p>
-      <w:pPr>
-        <w:numPr>
-          <w:ilvl w:val="0"/>
-          <w:numId w:val="1"/>
-        </w:numPr>
-      </w:pPr>
-      <w:r>
-        <w:t>A streaming platform wants to recommend movies to users by grouping them based on their viewing preferences and watch history.</w:t>
-      </w:r>
-      <w:r>
-        <w:br/>
-        <w:t xml:space="preserve"> </w:t>
-      </w:r>
-      <w:r>
-        <w:rPr>
-          <w:b/>
-        </w:rPr>
-        <w:t>Q:</w:t>
-      </w:r>
-      <w:r>
-        <w:t xml:space="preserve"> Identify the problem type and outline the step-by-step logic to solve it.</w:t>
-      </w:r>
     </w:p>
     <w:p>
       <w:pPr>
         <w:ind w:left="720"/>
         <w:rPr>
-          <w:b/>
-          <w:bCs/>
-          <w:color w:val="1F497D" w:themeColor="text2"/>
-        </w:rPr>
-      </w:pPr>
-      <w:r>
-        <w:rPr>
-          <w:b/>
-          <w:bCs/>
-          <w:color w:val="1F497D" w:themeColor="text2"/>
-        </w:rPr>
-        <w:t>Answer:</w:t>
+          <w:color w:val="1F497D" w:themeColor="text2"/>
+        </w:rPr>
+      </w:pPr>
+      <w:r>
+        <w:rPr>
+          <w:color w:val="1F497D" w:themeColor="text2"/>
+        </w:rPr>
+        <w:t xml:space="preserve">step 1: Machine Learning </w:t>
       </w:r>
     </w:p>
     <w:p>
@@ -2560,13 +4167,7 @@
         <w:rPr>
           <w:color w:val="1F497D" w:themeColor="text2"/>
         </w:rPr>
-        <w:t xml:space="preserve">Problem Type: </w:t>
-      </w:r>
-      <w:r>
-        <w:rPr>
-          <w:color w:val="1F497D" w:themeColor="text2"/>
-        </w:rPr>
-        <w:t xml:space="preserve">Clustering Problem </w:t>
+        <w:t xml:space="preserve">step 2: supervised Learning </w:t>
       </w:r>
     </w:p>
     <w:p>
@@ -2580,231 +4181,30 @@
         <w:rPr>
           <w:color w:val="1F497D" w:themeColor="text2"/>
         </w:rPr>
-        <w:t>Step by Step logic:</w:t>
-      </w:r>
-    </w:p>
-    <w:p>
-      <w:pPr>
-        <w:pStyle w:val="ListParagraph"/>
-        <w:numPr>
-          <w:ilvl w:val="0"/>
-          <w:numId w:val="3"/>
-        </w:numPr>
-        <w:rPr>
-          <w:color w:val="1F497D" w:themeColor="text2"/>
-        </w:rPr>
-      </w:pPr>
-      <w:r>
-        <w:rPr>
-          <w:color w:val="1F497D" w:themeColor="text2"/>
-        </w:rPr>
-        <w:t xml:space="preserve">Load the </w:t>
-      </w:r>
-      <w:r>
-        <w:rPr>
-          <w:color w:val="1F497D" w:themeColor="text2"/>
-        </w:rPr>
-        <w:t>movie_recommendation</w:t>
-      </w:r>
-      <w:r>
-        <w:rPr>
-          <w:color w:val="1F497D" w:themeColor="text2"/>
-        </w:rPr>
-        <w:t xml:space="preserve"> dataset</w:t>
-      </w:r>
-    </w:p>
-    <w:p>
-      <w:pPr>
-        <w:pStyle w:val="ListParagraph"/>
-        <w:numPr>
-          <w:ilvl w:val="0"/>
-          <w:numId w:val="3"/>
-        </w:numPr>
-        <w:rPr>
-          <w:color w:val="1F497D" w:themeColor="text2"/>
-        </w:rPr>
-      </w:pPr>
-      <w:r>
-        <w:rPr>
-          <w:color w:val="1F497D" w:themeColor="text2"/>
-        </w:rPr>
-        <w:t>Select the important features for X input data - (</w:t>
-      </w:r>
-      <w:r>
-        <w:rPr>
-          <w:color w:val="1F497D" w:themeColor="text2"/>
-        </w:rPr>
-        <w:t>viewing preferences, watch</w:t>
-      </w:r>
-      <w:r>
-        <w:rPr>
-          <w:color w:val="1F497D" w:themeColor="text2"/>
-        </w:rPr>
-        <w:t xml:space="preserve"> history)</w:t>
-      </w:r>
-    </w:p>
-    <w:p>
-      <w:pPr>
-        <w:pStyle w:val="ListParagraph"/>
-        <w:numPr>
-          <w:ilvl w:val="0"/>
-          <w:numId w:val="3"/>
-        </w:numPr>
-        <w:rPr>
-          <w:color w:val="1F497D" w:themeColor="text2"/>
-        </w:rPr>
-      </w:pPr>
-      <w:r>
-        <w:rPr>
-          <w:color w:val="1F497D" w:themeColor="text2"/>
-        </w:rPr>
-        <w:t>Data preprocessing – Standardization</w:t>
-      </w:r>
-    </w:p>
-    <w:p>
-      <w:pPr>
-        <w:pStyle w:val="ListParagraph"/>
-        <w:numPr>
-          <w:ilvl w:val="0"/>
-          <w:numId w:val="3"/>
-        </w:numPr>
-        <w:rPr>
-          <w:color w:val="1F497D" w:themeColor="text2"/>
-        </w:rPr>
-      </w:pPr>
-      <w:r>
-        <w:rPr>
-          <w:color w:val="1F497D" w:themeColor="text2"/>
-        </w:rPr>
-        <w:t xml:space="preserve">Model creation &amp; prediction of Y_labels [cluster group] – (using clustering algorithms: K means, agglomerative, DBSCAN, optics, birch etc.) </w:t>
-      </w:r>
-    </w:p>
-    <w:p>
-      <w:pPr>
-        <w:pStyle w:val="ListParagraph"/>
-        <w:numPr>
-          <w:ilvl w:val="0"/>
-          <w:numId w:val="3"/>
-        </w:numPr>
-        <w:rPr>
-          <w:color w:val="1F497D" w:themeColor="text2"/>
-        </w:rPr>
-      </w:pPr>
-      <w:r>
-        <w:rPr>
-          <w:color w:val="1F497D" w:themeColor="text2"/>
-        </w:rPr>
-        <w:t xml:space="preserve">Create a new dataset with the cluster group &amp; save it as ‘cluster.csv’ file </w:t>
-      </w:r>
-    </w:p>
-    <w:p>
-      <w:pPr>
-        <w:pStyle w:val="ListParagraph"/>
-        <w:numPr>
-          <w:ilvl w:val="0"/>
-          <w:numId w:val="3"/>
-        </w:numPr>
-        <w:rPr>
-          <w:color w:val="1F497D" w:themeColor="text2"/>
-        </w:rPr>
-      </w:pPr>
-      <w:r>
-        <w:rPr>
-          <w:color w:val="1F497D" w:themeColor="text2"/>
-        </w:rPr>
-        <w:t>Visualize the clusters using seaborn.lmplot – (for visual inspection of clusters)</w:t>
-      </w:r>
-    </w:p>
-    <w:p>
-      <w:pPr>
-        <w:pStyle w:val="ListParagraph"/>
-        <w:numPr>
-          <w:ilvl w:val="0"/>
-          <w:numId w:val="3"/>
-        </w:numPr>
-        <w:rPr>
-          <w:color w:val="1F497D" w:themeColor="text2"/>
-        </w:rPr>
-      </w:pPr>
-      <w:r>
-        <w:rPr>
-          <w:color w:val="1F497D" w:themeColor="text2"/>
-        </w:rPr>
-        <w:t xml:space="preserve">Cluster model evaluation using cluster evaluation metrics </w:t>
-      </w:r>
-    </w:p>
-    <w:p>
-      <w:pPr>
-        <w:pStyle w:val="ListParagraph"/>
-        <w:numPr>
-          <w:ilvl w:val="0"/>
-          <w:numId w:val="3"/>
-        </w:numPr>
-        <w:rPr>
-          <w:color w:val="1F497D" w:themeColor="text2"/>
-        </w:rPr>
-      </w:pPr>
-      <w:r>
-        <w:rPr>
-          <w:color w:val="1F497D" w:themeColor="text2"/>
-        </w:rPr>
-        <w:t>Finalize the best cluster model for the problem statement – (by analyzing the cluster outputs, evaluation metric, domain knowledge and visual cluster plot)</w:t>
-      </w:r>
-    </w:p>
-    <w:p>
-      <w:pPr>
-        <w:ind w:left="720"/>
-      </w:pPr>
-    </w:p>
-    <w:p/>
-    <w:p>
-      <w:pPr>
-        <w:numPr>
-          <w:ilvl w:val="0"/>
-          <w:numId w:val="1"/>
-        </w:numPr>
-      </w:pPr>
-      <w:r>
-        <w:t>A hospital wants to predict the recovery time of patients after surgery based on their age, medical history, and lifestyle habits.</w:t>
-      </w:r>
-      <w:r>
-        <w:br/>
-        <w:t xml:space="preserve"> </w:t>
-      </w:r>
-      <w:r>
-        <w:rPr>
-          <w:b/>
-        </w:rPr>
-        <w:t>Q:</w:t>
-      </w:r>
-      <w:r>
-        <w:t xml:space="preserve"> Identify the problem type and outline the step-by-step logic to solve it.</w:t>
-      </w:r>
-      <w:r>
-        <w:br/>
-      </w:r>
-      <w:r>
-        <w:rPr>
-          <w:b/>
-          <w:bCs/>
-          <w:color w:val="1F497D" w:themeColor="text2"/>
-        </w:rPr>
-        <w:t>Answer:</w:t>
-      </w:r>
-    </w:p>
-    <w:p>
-      <w:pPr>
-        <w:pStyle w:val="ListParagraph"/>
-        <w:rPr>
-          <w:color w:val="1F497D" w:themeColor="text2"/>
-        </w:rPr>
-      </w:pPr>
-      <w:r>
-        <w:rPr>
-          <w:color w:val="1F497D" w:themeColor="text2"/>
-        </w:rPr>
-        <w:t xml:space="preserve">Problem Type: </w:t>
-      </w:r>
+        <w:t xml:space="preserve">step 3: Regression </w:t>
+      </w:r>
+      <w:r>
+        <w:rPr>
+          <w:color w:val="1F497D" w:themeColor="text2"/>
+        </w:rPr>
+        <w:t xml:space="preserve">problem </w:t>
+      </w:r>
+    </w:p>
+    <w:p>
+      <w:pPr>
+        <w:pStyle w:val="ListParagraph"/>
+        <w:rPr>
+          <w:color w:val="1F497D" w:themeColor="text2"/>
+        </w:rPr>
+      </w:pPr>
+    </w:p>
+    <w:p>
+      <w:pPr>
+        <w:pStyle w:val="ListParagraph"/>
+        <w:rPr>
+          <w:color w:val="1F497D" w:themeColor="text2"/>
+        </w:rPr>
+      </w:pPr>
       <w:r>
         <w:rPr>
           <w:color w:val="1F497D" w:themeColor="text2"/>
@@ -2853,7 +4253,7 @@
         <w:rPr>
           <w:color w:val="1F497D" w:themeColor="text2"/>
         </w:rPr>
-        <w:t>surgery_patients</w:t>
+        <w:t>student</w:t>
       </w:r>
       <w:r>
         <w:rPr>
@@ -2880,14 +4280,22 @@
         <w:rPr>
           <w:color w:val="1F497D" w:themeColor="text2"/>
         </w:rPr>
-        <w:t>(life style habits-physical activity</w:t>
-      </w:r>
-      <w:r>
-        <w:rPr>
-          <w:color w:val="1F497D" w:themeColor="text2"/>
-        </w:rPr>
-        <w:t xml:space="preserve"> column) into numerical data using pd.get_dummies</w:t>
-      </w:r>
+        <w:t xml:space="preserve">(past academic performance – Grades </w:t>
+      </w:r>
+      <w:r>
+        <w:rPr>
+          <w:color w:val="1F497D" w:themeColor="text2"/>
+        </w:rPr>
+        <w:t xml:space="preserve">column) into numerical data using </w:t>
+      </w:r>
+      <w:proofErr w:type="spellStart"/>
+      <w:r>
+        <w:rPr>
+          <w:color w:val="1F497D" w:themeColor="text2"/>
+        </w:rPr>
+        <w:t>pd.get_dummies</w:t>
+      </w:r>
+      <w:proofErr w:type="spellEnd"/>
     </w:p>
     <w:p>
       <w:pPr>
@@ -2907,37 +4315,19 @@
         <w:rPr>
           <w:color w:val="1F497D" w:themeColor="text2"/>
         </w:rPr>
-        <w:t xml:space="preserve"> (</w:t>
-      </w:r>
-      <w:r>
-        <w:rPr>
-          <w:color w:val="1F497D" w:themeColor="text2"/>
-        </w:rPr>
-        <w:t xml:space="preserve">age ;  medical_history – diabetes, BMI, hyper tension; </w:t>
-      </w:r>
-      <w:r>
-        <w:rPr>
-          <w:color w:val="1F497D" w:themeColor="text2"/>
-        </w:rPr>
-        <w:t>life style habits-physical activity</w:t>
-      </w:r>
-      <w:r>
-        <w:rPr>
-          <w:color w:val="1F497D" w:themeColor="text2"/>
-        </w:rPr>
-        <w:t xml:space="preserve"> column</w:t>
-      </w:r>
-      <w:r>
-        <w:rPr>
-          <w:color w:val="1F497D" w:themeColor="text2"/>
-        </w:rPr>
-        <w:t>s</w:t>
-      </w:r>
-      <w:r>
-        <w:rPr>
-          <w:color w:val="1F497D" w:themeColor="text2"/>
-        </w:rPr>
-        <w:t>)</w:t>
+        <w:t xml:space="preserve"> (study hours, attendance, past academic performance </w:t>
+      </w:r>
+      <w:r>
+        <w:rPr>
+          <w:color w:val="1F497D" w:themeColor="text2"/>
+        </w:rPr>
+        <w:t>column</w:t>
+      </w:r>
+      <w:r>
+        <w:rPr>
+          <w:color w:val="1F497D" w:themeColor="text2"/>
+        </w:rPr>
+        <w:t>s)</w:t>
       </w:r>
       <w:r>
         <w:rPr>
@@ -2949,19 +4339,7 @@
         <w:rPr>
           <w:color w:val="1F497D" w:themeColor="text2"/>
         </w:rPr>
-        <w:t xml:space="preserve"> (</w:t>
-      </w:r>
-      <w:r>
-        <w:rPr>
-          <w:color w:val="1F497D" w:themeColor="text2"/>
-        </w:rPr>
-        <w:t>patients_recovery_time</w:t>
-      </w:r>
-      <w:r>
-        <w:rPr>
-          <w:color w:val="1F497D" w:themeColor="text2"/>
-        </w:rPr>
-        <w:t>)</w:t>
+        <w:t xml:space="preserve"> (student’s final exam score)</w:t>
       </w:r>
     </w:p>
     <w:p>
@@ -2991,305 +4369,21 @@
         <w:rPr>
           <w:color w:val="1F497D" w:themeColor="text2"/>
         </w:rPr>
-        <w:t>Model creation using regression algorithms (linear regression, SVR, decision tree, random forest, boosting etc…)</w:t>
-      </w:r>
-    </w:p>
-    <w:p>
-      <w:pPr>
-        <w:pStyle w:val="ListParagraph"/>
-        <w:numPr>
-          <w:ilvl w:val="1"/>
-          <w:numId w:val="2"/>
-        </w:numPr>
-      </w:pPr>
-      <w:r>
-        <w:rPr>
-          <w:color w:val="1F497D" w:themeColor="text2"/>
-        </w:rPr>
-        <w:t>Test the model prediction</w:t>
-      </w:r>
-    </w:p>
-    <w:p>
-      <w:pPr>
-        <w:pStyle w:val="ListParagraph"/>
-        <w:numPr>
-          <w:ilvl w:val="1"/>
-          <w:numId w:val="2"/>
-        </w:numPr>
-      </w:pPr>
-      <w:r>
-        <w:rPr>
-          <w:color w:val="1F497D" w:themeColor="text2"/>
-        </w:rPr>
-        <w:t xml:space="preserve">Evaluate the model using r2_score </w:t>
-      </w:r>
-    </w:p>
-    <w:p>
-      <w:pPr>
-        <w:pStyle w:val="ListParagraph"/>
-        <w:rPr>
-          <w:color w:val="1F497D" w:themeColor="text2"/>
-        </w:rPr>
-      </w:pPr>
-      <w:r>
-        <w:rPr>
-          <w:color w:val="1F497D" w:themeColor="text2"/>
-        </w:rPr>
-        <w:t>Finalize the best model (by comparing all algorithm performance for the dataset)</w:t>
-      </w:r>
-    </w:p>
-    <w:p>
-      <w:pPr>
-        <w:ind w:left="720"/>
-      </w:pPr>
-    </w:p>
-    <w:p/>
-    <w:p>
-      <w:pPr>
-        <w:numPr>
-          <w:ilvl w:val="0"/>
-          <w:numId w:val="1"/>
-        </w:numPr>
-      </w:pPr>
-      <w:r>
-        <w:t>A university wants to predict a student’s final exam score based on study hours, attendance, and past academic performance.</w:t>
-      </w:r>
-      <w:r>
-        <w:br/>
-        <w:t xml:space="preserve"> </w:t>
-      </w:r>
-      <w:r>
-        <w:rPr>
-          <w:b/>
-        </w:rPr>
-        <w:t>Q:</w:t>
-      </w:r>
-      <w:r>
-        <w:t xml:space="preserve"> Identify the problem type and outline the step-by-step logic to solve it.</w:t>
-      </w:r>
-    </w:p>
-    <w:p>
-      <w:pPr>
-        <w:ind w:firstLine="360"/>
-        <w:rPr>
-          <w:b/>
-          <w:bCs/>
-          <w:color w:val="1F497D" w:themeColor="text2"/>
-        </w:rPr>
-      </w:pPr>
-      <w:r>
-        <w:rPr>
-          <w:b/>
-          <w:bCs/>
-          <w:color w:val="1F497D" w:themeColor="text2"/>
-        </w:rPr>
-        <w:t>Answer:</w:t>
-      </w:r>
-    </w:p>
-    <w:p>
-      <w:pPr>
-        <w:ind w:firstLine="360"/>
-        <w:rPr>
-          <w:b/>
-          <w:bCs/>
-          <w:color w:val="1F497D" w:themeColor="text2"/>
-        </w:rPr>
-      </w:pPr>
-    </w:p>
-    <w:p>
-      <w:pPr>
-        <w:pStyle w:val="ListParagraph"/>
-        <w:rPr>
-          <w:color w:val="1F497D" w:themeColor="text2"/>
-        </w:rPr>
-      </w:pPr>
-      <w:r>
-        <w:rPr>
-          <w:color w:val="1F497D" w:themeColor="text2"/>
-        </w:rPr>
-        <w:t xml:space="preserve">Problem Type: </w:t>
-      </w:r>
-      <w:r>
-        <w:rPr>
-          <w:color w:val="1F497D" w:themeColor="text2"/>
-        </w:rPr>
-        <w:t xml:space="preserve">Regression </w:t>
-      </w:r>
-      <w:r>
-        <w:rPr>
-          <w:color w:val="1F497D" w:themeColor="text2"/>
-        </w:rPr>
-        <w:t xml:space="preserve">Problem </w:t>
-      </w:r>
-    </w:p>
-    <w:p>
-      <w:pPr>
-        <w:pStyle w:val="ListParagraph"/>
-        <w:rPr>
-          <w:color w:val="1F497D" w:themeColor="text2"/>
-        </w:rPr>
-      </w:pPr>
-      <w:r>
-        <w:rPr>
-          <w:color w:val="1F497D" w:themeColor="text2"/>
-        </w:rPr>
-        <w:t>Step by Step logic:</w:t>
-      </w:r>
-    </w:p>
-    <w:p>
-      <w:pPr>
-        <w:pStyle w:val="ListParagraph"/>
-        <w:numPr>
-          <w:ilvl w:val="1"/>
-          <w:numId w:val="2"/>
-        </w:numPr>
-        <w:rPr>
-          <w:color w:val="1F497D" w:themeColor="text2"/>
-        </w:rPr>
-      </w:pPr>
-      <w:r>
-        <w:rPr>
-          <w:color w:val="1F497D" w:themeColor="text2"/>
-        </w:rPr>
-        <w:t xml:space="preserve">Load the </w:t>
-      </w:r>
-      <w:r>
-        <w:rPr>
-          <w:color w:val="1F497D" w:themeColor="text2"/>
-        </w:rPr>
-        <w:t>student</w:t>
-      </w:r>
-      <w:r>
-        <w:rPr>
-          <w:color w:val="1F497D" w:themeColor="text2"/>
-        </w:rPr>
-        <w:t xml:space="preserve"> dataset</w:t>
-      </w:r>
-    </w:p>
-    <w:p>
-      <w:pPr>
-        <w:pStyle w:val="ListParagraph"/>
-        <w:numPr>
-          <w:ilvl w:val="1"/>
-          <w:numId w:val="2"/>
-        </w:numPr>
-      </w:pPr>
-      <w:r>
-        <w:rPr>
-          <w:color w:val="1F497D" w:themeColor="text2"/>
-        </w:rPr>
-        <w:t xml:space="preserve">Convert the categorical data </w:t>
-      </w:r>
-      <w:r>
-        <w:rPr>
-          <w:color w:val="1F497D" w:themeColor="text2"/>
-        </w:rPr>
-        <w:t>(</w:t>
-      </w:r>
-      <w:r>
-        <w:rPr>
-          <w:color w:val="1F497D" w:themeColor="text2"/>
-        </w:rPr>
-        <w:t xml:space="preserve">past academic performance – Grades </w:t>
-      </w:r>
-      <w:r>
-        <w:rPr>
-          <w:color w:val="1F497D" w:themeColor="text2"/>
-        </w:rPr>
-        <w:t>column) into numerical data using pd.get_dummies</w:t>
-      </w:r>
-    </w:p>
-    <w:p>
-      <w:pPr>
-        <w:pStyle w:val="ListParagraph"/>
-        <w:numPr>
-          <w:ilvl w:val="1"/>
-          <w:numId w:val="2"/>
-        </w:numPr>
-      </w:pPr>
-      <w:r>
-        <w:rPr>
-          <w:color w:val="1F497D" w:themeColor="text2"/>
-        </w:rPr>
-        <w:t>Split input</w:t>
-      </w:r>
-      <w:r>
-        <w:rPr>
-          <w:color w:val="1F497D" w:themeColor="text2"/>
-        </w:rPr>
-        <w:t xml:space="preserve"> (</w:t>
-      </w:r>
-      <w:r>
-        <w:rPr>
-          <w:color w:val="1F497D" w:themeColor="text2"/>
-        </w:rPr>
-        <w:t xml:space="preserve">study hours, attendance, past academic performance </w:t>
-      </w:r>
-      <w:r>
-        <w:rPr>
-          <w:color w:val="1F497D" w:themeColor="text2"/>
-        </w:rPr>
-        <w:t>column</w:t>
-      </w:r>
-      <w:r>
-        <w:rPr>
-          <w:color w:val="1F497D" w:themeColor="text2"/>
-        </w:rPr>
-        <w:t>s)</w:t>
-      </w:r>
-      <w:r>
-        <w:rPr>
-          <w:color w:val="1F497D" w:themeColor="text2"/>
-        </w:rPr>
-        <w:t xml:space="preserve"> and output</w:t>
-      </w:r>
-      <w:r>
-        <w:rPr>
-          <w:color w:val="1F497D" w:themeColor="text2"/>
-        </w:rPr>
-        <w:t xml:space="preserve"> (</w:t>
-      </w:r>
-      <w:r>
-        <w:rPr>
-          <w:color w:val="1F497D" w:themeColor="text2"/>
-        </w:rPr>
-        <w:t>student’s final exam score</w:t>
-      </w:r>
-      <w:r>
-        <w:rPr>
-          <w:color w:val="1F497D" w:themeColor="text2"/>
-        </w:rPr>
-        <w:t>)</w:t>
-      </w:r>
-    </w:p>
-    <w:p>
-      <w:pPr>
-        <w:pStyle w:val="ListParagraph"/>
-        <w:numPr>
-          <w:ilvl w:val="1"/>
-          <w:numId w:val="2"/>
-        </w:numPr>
-      </w:pPr>
-      <w:r>
-        <w:rPr>
-          <w:color w:val="1F497D" w:themeColor="text2"/>
-        </w:rPr>
-        <w:t>Split train and test dataset</w:t>
-      </w:r>
-    </w:p>
-    <w:p>
-      <w:pPr>
-        <w:pStyle w:val="ListParagraph"/>
-        <w:numPr>
-          <w:ilvl w:val="1"/>
-          <w:numId w:val="2"/>
-        </w:numPr>
-      </w:pPr>
-      <w:r>
-        <w:rPr>
-          <w:color w:val="1F497D" w:themeColor="text2"/>
-        </w:rPr>
-        <w:t>Model creation using regression algorithms (linear regression, SVR, decision tree, random forest, boosting etc…)</w:t>
+        <w:t xml:space="preserve">Model creation using regression algorithms (linear regression, SVR, decision tree, random forest, boosting </w:t>
+      </w:r>
+      <w:proofErr w:type="spellStart"/>
+      <w:r>
+        <w:rPr>
+          <w:color w:val="1F497D" w:themeColor="text2"/>
+        </w:rPr>
+        <w:t>etc</w:t>
+      </w:r>
+      <w:proofErr w:type="spellEnd"/>
+      <w:r>
+        <w:rPr>
+          <w:color w:val="1F497D" w:themeColor="text2"/>
+        </w:rPr>
+        <w:t>…)</w:t>
       </w:r>
     </w:p>
     <w:p>
@@ -5017,6 +6111,12 @@
 </file>
 
 <file path=customXml/item1.xml><?xml version="1.0" encoding="utf-8"?>
+<go:gDocsCustomXmlDataStorage xmlns:go="http://customooxmlschemas.google.com/" xmlns:r="http://schemas.openxmlformats.org/officeDocument/2006/relationships" uri="GoogleDocsCustomDataVersion2">
+  <go:docsCustomData xmlns:go="http://customooxmlschemas.google.com/" roundtripDataSignature="AMtx7miq8z2U3TSG9Csd0Qtag+YyXFeeVA==">CgMxLjA4AHIhMWR1OG9ZdE9lbURNb0xTbmJXT3J6Z0pralBwTGZiWGVR</go:docsCustomData>
+</go:gDocsCustomXmlDataStorage>
+</file>
+
+<file path=customXml/item2.xml><?xml version="1.0" encoding="utf-8"?>
 <s:customData xmlns="http://www.wps.cn/officeDocument/2013/wpsCustomData" xmlns:s="http://www.wps.cn/officeDocument/2013/wpsCustomData">
   <customSectProps/>
   <customShpExts>
@@ -5026,25 +6126,19 @@
 </s:customData>
 </file>
 
-<file path=customXml/item2.xml><?xml version="1.0" encoding="utf-8"?>
-<go:gDocsCustomXmlDataStorage xmlns:go="http://customooxmlschemas.google.com/" xmlns:r="http://schemas.openxmlformats.org/officeDocument/2006/relationships" uri="GoogleDocsCustomDataVersion2">
-  <go:docsCustomData xmlns:go="http://customooxmlschemas.google.com/" roundtripDataSignature="AMtx7miq8z2U3TSG9Csd0Qtag+YyXFeeVA==">CgMxLjA4AHIhMWR1OG9ZdE9lbURNb0xTbmJXT3J6Z0pralBwTGZiWGVR</go:docsCustomData>
-</go:gDocsCustomXmlDataStorage>
-</file>
-
 <file path=customXml/itemProps1.xml><?xml version="1.0" encoding="utf-8"?>
-<ds:datastoreItem xmlns:ds="http://schemas.openxmlformats.org/officeDocument/2006/customXml" ds:itemID="{B1977F7D-205B-4081-913C-38D41E755F92}">
-  <ds:schemaRefs>
-    <ds:schemaRef ds:uri="http://www.wps.cn/officeDocument/2013/wpsCustomData"/>
-  </ds:schemaRefs>
-</ds:datastoreItem>
-</file>
-
-<file path=customXml/itemProps2.xml><?xml version="1.0" encoding="utf-8"?>
 <ds:datastoreItem xmlns:ds="http://schemas.openxmlformats.org/officeDocument/2006/customXml" ds:itemID="{11111111-1234-1234-1234-123412341234}">
   <ds:schemaRefs>
     <ds:schemaRef ds:uri="http://customooxmlschemas.google.com/"/>
     <ds:schemaRef ds:uri="http://schemas.openxmlformats.org/officeDocument/2006/relationships"/>
   </ds:schemaRefs>
 </ds:datastoreItem>
+</file>
+
+<file path=customXml/itemProps2.xml><?xml version="1.0" encoding="utf-8"?>
+<ds:datastoreItem xmlns:ds="http://schemas.openxmlformats.org/officeDocument/2006/customXml" ds:itemID="{B1977F7D-205B-4081-913C-38D41E755F92}">
+  <ds:schemaRefs>
+    <ds:schemaRef ds:uri="http://www.wps.cn/officeDocument/2013/wpsCustomData"/>
+  </ds:schemaRefs>
+</ds:datastoreItem>
 </file>
</xml_diff>